<commit_message>
docs: update comprehensive technical documentation and docx across all 8 modules and middleware
</commit_message>
<xml_diff>
--- a/DOCUMENTATION.docx
+++ b/DOCUMENTATION.docx
@@ -4,108 +4,3410 @@
   <w:body>
     <w:p>
       <w:pPr>
-        <w:jc w:val="center"/>
+        <w:pStyle w:val="Title"/>
+        <w:spacing w:before="240" w:after="80"/>
       </w:pPr>
       <w:r>
         <w:rPr>
           <w:rFonts w:ascii="Calibri" w:hAnsi="Calibri"/>
           <w:b/>
           <w:color w:val="0F172A"/>
-          <w:sz w:val="48"/>
+          <w:sz w:val="44"/>
         </w:rPr>
-        <w:t>ENTERPRISE B2B &amp; 3PL LOGISTICS PLATFORM</w:t>
+        <w:t>Enterprise B2B &amp; 3PL Multi-Stakeholder Dispatch, Audit, and Invoice Settlement Platform</w:t>
       </w:r>
     </w:p>
     <w:p>
       <w:pPr>
-        <w:jc w:val="center"/>
+        <w:pStyle w:val="Heading1"/>
+        <w:spacing w:before="280" w:after="80"/>
       </w:pPr>
       <w:r>
         <w:rPr>
-          <w:i/>
-          <w:color w:val="475569"/>
-          <w:sz w:val="26"/>
+          <w:rFonts w:ascii="Calibri" w:hAnsi="Calibri"/>
+          <w:b/>
+          <w:color w:val="1E3A8A"/>
+          <w:sz w:val="32"/>
         </w:rPr>
-        <w:t>Frontend Technical &amp; Functional Architecture Documentation</w:t>
-        <w:br/>
-        <w:t>Proof of Delivery (POD) to Cash Pipeline</w:t>
+        <w:t>Frontend Technical &amp; Functional Documentation</w:t>
       </w:r>
     </w:p>
     <w:p>
       <w:pPr>
-        <w:spacing w:after="240"/>
-      </w:pPr>
+        <w:spacing w:before="120" w:after="120"/>
+      </w:pPr>
+      <w:r>
+        <w:rPr>
+          <w:color w:val="CBD5E1"/>
+          <w:sz w:val="16"/>
+        </w:rPr>
+        <w:t>_______________________________________________________________________________</w:t>
+      </w:r>
     </w:p>
     <w:p>
       <w:pPr>
-        <w:pStyle w:val="Heading1"/>
-      </w:pPr>
-      <w:r>
-        <w:t>1. Executive Overview &amp; System Lifecycle</w:t>
+        <w:pStyle w:val="Heading2"/>
+        <w:spacing w:before="200" w:after="40"/>
+      </w:pPr>
+      <w:r>
+        <w:rPr>
+          <w:rFonts w:ascii="Calibri" w:hAnsi="Calibri"/>
+          <w:b/>
+          <w:color w:val="334155"/>
+          <w:sz w:val="25"/>
+        </w:rPr>
+        <w:t>Executive Overview &amp; System Architecture</w:t>
       </w:r>
     </w:p>
     <w:p>
       <w:pPr>
-        <w:spacing w:after="160"/>
-      </w:pPr>
-      <w:r>
-        <w:t>This platform digitizes and automates the enterprise 'Proof of Delivery (POD) to Cash' supply chain pipeline. Built using Next.js (App Router), Tailwind CSS, and shadcn/ui primitives, the system connects five distinct stakeholders into a unified real-time workflow that eliminates paper latency, unverified cash floats, and invoice dispute delays.</w:t>
+        <w:spacing w:before="40" w:after="80"/>
+      </w:pPr>
+      <w:r>
+        <w:t xml:space="preserve">This platform digitizes and automates the end-to-end </w:t>
+      </w:r>
+      <w:r>
+        <w:rPr>
+          <w:b/>
+        </w:rPr>
+        <w:t>"Proof of Delivery (POD) to Cash"</w:t>
+      </w:r>
+      <w:r>
+        <w:t xml:space="preserve"> lifecycle across modern enterprise supply chains and third-party logistics (3PL) operations. In traditional logistics ecosystems, paper-based Lorry Receipts (LRs), unverified cash floats, delayed gate stamps, and invoice reconciliation lag lead to high Days Sales Outstanding (DSO), friction between consignees and carriers, and revenue leakage.</w:t>
+      </w:r>
+    </w:p>
+    <w:p>
+      <w:pPr>
+        <w:spacing w:before="40" w:after="80"/>
+      </w:pPr>
+      <w:r>
+        <w:t xml:space="preserve">The frontend is architected using </w:t>
+      </w:r>
+      <w:r>
+        <w:rPr>
+          <w:b/>
+        </w:rPr>
+        <w:t>Next.js 14 (App Router)</w:t>
+      </w:r>
+      <w:r>
+        <w:t xml:space="preserve">, </w:t>
+      </w:r>
+      <w:r>
+        <w:rPr>
+          <w:b/>
+        </w:rPr>
+        <w:t>Tailwind CSS</w:t>
+      </w:r>
+      <w:r>
+        <w:t xml:space="preserve">, and </w:t>
+      </w:r>
+      <w:r>
+        <w:rPr>
+          <w:b/>
+        </w:rPr>
+        <w:t>shadcn/ui</w:t>
+      </w:r>
+      <w:r>
+        <w:t xml:space="preserve"> primitives to support distinct, interconnected roles governed by an edge route-guard middleware and administrative governance:</w:t>
+      </w:r>
+    </w:p>
+    <w:p>
+      <w:pPr>
+        <w:spacing w:before="80" w:after="160"/>
+        <w:ind w:left="288"/>
+      </w:pPr>
+      <w:r>
+        <w:rPr>
+          <w:rFonts w:ascii="Consolas" w:hAnsi="Consolas"/>
+          <w:color w:val="1E293B"/>
+          <w:sz w:val="17"/>
+        </w:rPr>
+        <w:t>┌────────────────────────────────────────────────────────────────────────────────────────┐</w:t>
+        <w:br/>
+        <w:t>│                        LOGISTICS POD-TO-CASH PLATFORM ECOSYSTEM                        │</w:t>
+        <w:br/>
+        <w:t>└────────────────────────────────────────────────────────────────────────────────────────┘</w:t>
+        <w:br/>
+        <w:br/>
+        <w:t xml:space="preserve">                       [Edge Route Guard: middleware.ts]</w:t>
+        <w:br/>
+        <w:t xml:space="preserve">                                       │</w:t>
+        <w:br/>
+        <w:t xml:space="preserve">            ┌──────────────────────────┴──────────────────────────┐</w:t>
+        <w:br/>
+        <w:t xml:space="preserve">            ▼                                                     ▼</w:t>
+        <w:br/>
+        <w:t xml:space="preserve">     [/login Portal]                                     [/invite/accept]</w:t>
+        <w:br/>
+        <w:t xml:space="preserve">  SSO / Credentials / Presets                         Token Validation &amp; 5-Rule</w:t>
+        <w:br/>
+        <w:t xml:space="preserve">  Session Cookie (vecto_access_token)                 Password Policy Engine</w:t>
+        <w:br/>
+        <w:t xml:space="preserve">            │</w:t>
+        <w:br/>
+        <w:t xml:space="preserve">            ├─────────────────────────────────────────────────────┐</w:t>
+        <w:br/>
+        <w:t xml:space="preserve">            ▼                                                     ▼</w:t>
+        <w:br/>
+        <w:t xml:space="preserve">   [1. Dispatch Ops] ──────▶ [2. Driver Mobile] ──────▶ [3. Internal Audit]</w:t>
+        <w:br/>
+        <w:t xml:space="preserve">    Live GPS Telematics       Outdoor HUD &amp; Nav           50/50 Split-Pane Review</w:t>
+        <w:br/>
+        <w:t xml:space="preserve">    Driver Advance Float       Camera POD Capture          Digital Stamp &amp; Sign Match</w:t>
+        <w:br/>
+        <w:t xml:space="preserve">    Odometer Gate Tracking     Glass Digital Sign          Financial Variance Check</w:t>
+        <w:br/>
+        <w:t xml:space="preserve">             │                         │                              │</w:t>
+        <w:br/>
+        <w:t xml:space="preserve">             │                         │                              ▼</w:t>
+        <w:br/>
+        <w:t xml:space="preserve">             │                         │                   [4. Accounts &amp; Billing]</w:t>
+        <w:br/>
+        <w:t xml:space="preserve">             │                         │                    Unbilled Trips Queue</w:t>
+        <w:br/>
+        <w:t xml:space="preserve">             │                         │                    Consolidated GST Tax Inv</w:t>
+        <w:br/>
+        <w:t xml:space="preserve">             │                         │                    18% IGST / SAC 996511</w:t>
+        <w:br/>
+        <w:t xml:space="preserve">             │                         │                              │</w:t>
+        <w:br/>
+        <w:t xml:space="preserve">             │                         │                              ▼</w:t>
+        <w:br/>
+        <w:t xml:space="preserve">             └─────────────────────────┴──────────────────▶ [5. Client AP Portal]</w:t>
+        <w:br/>
+        <w:t xml:space="preserve">                                                            Invoice Inbox &amp; Review</w:t>
+        <w:br/>
+        <w:t xml:space="preserve">                                                            Interactive POD Proof</w:t>
+        <w:br/>
+        <w:t xml:space="preserve">                                                            Inline Trip Dispute Flagging</w:t>
+        <w:br/>
+        <w:t xml:space="preserve">                                                                      │</w:t>
+        <w:br/>
+        <w:t xml:space="preserve">                                                                      ▼</w:t>
+        <w:br/>
+        <w:t xml:space="preserve">                                                            [6. Admin Master Data]</w:t>
+        <w:br/>
+        <w:t xml:space="preserve">                                                            Users &amp; Roles Directory</w:t>
+        <w:br/>
+        <w:t xml:space="preserve">                                                            Status &amp; Invite Management</w:t>
+        <w:br/>
+        <w:t xml:space="preserve">                                                            Vehicles / Drivers / Rates</w:t>
+        <w:br/>
+      </w:r>
+    </w:p>
+    <w:p>
+      <w:pPr>
+        <w:spacing w:before="120" w:after="120"/>
+      </w:pPr>
+      <w:r>
+        <w:rPr>
+          <w:color w:val="CBD5E1"/>
+          <w:sz w:val="16"/>
+        </w:rPr>
+        <w:t>_______________________________________________________________________________</w:t>
+      </w:r>
+    </w:p>
+    <w:p>
+      <w:pPr>
+        <w:pStyle w:val="Heading1"/>
+        <w:spacing w:before="280" w:after="80"/>
+      </w:pPr>
+      <w:r>
+        <w:rPr>
+          <w:rFonts w:ascii="Calibri" w:hAnsi="Calibri"/>
+          <w:b/>
+          <w:color w:val="1E3A8A"/>
+          <w:sz w:val="32"/>
+        </w:rPr>
+        <w:t>1. Dispatch Manager Dashboard (`/` &amp; `/dispatch`)</w:t>
+      </w:r>
+    </w:p>
+    <w:p>
+      <w:pPr>
+        <w:pStyle w:val="Heading2"/>
+        <w:spacing w:before="200" w:after="40"/>
+      </w:pPr>
+      <w:r>
+        <w:rPr>
+          <w:rFonts w:ascii="Calibri" w:hAnsi="Calibri"/>
+          <w:b/>
+          <w:color w:val="334155"/>
+          <w:sz w:val="25"/>
+        </w:rPr>
+        <w:t>1.1 Core Objective</w:t>
+      </w:r>
+    </w:p>
+    <w:p>
+      <w:pPr>
+        <w:spacing w:before="40" w:after="80"/>
+      </w:pPr>
+      <w:r>
+        <w:t>To grant regional dispatch superintendents real-time situational awareness over active fleet deployments, monitor route progress, manage driver cash/fuel floats, and execute End-of-Day (EOD) financial closures at hub terminals.</w:t>
+      </w:r>
+    </w:p>
+    <w:p>
+      <w:pPr>
+        <w:pStyle w:val="Heading2"/>
+        <w:spacing w:before="200" w:after="40"/>
+      </w:pPr>
+      <w:r>
+        <w:rPr>
+          <w:rFonts w:ascii="Calibri" w:hAnsi="Calibri"/>
+          <w:b/>
+          <w:color w:val="334155"/>
+          <w:sz w:val="25"/>
+        </w:rPr>
+        <w:t>1.2 Architectural &amp; UI/UX Design Rationale</w:t>
+      </w:r>
+    </w:p>
+    <w:p>
+      <w:pPr>
+        <w:pStyle w:val="ListBullet"/>
+        <w:spacing w:before="20" w:after="40"/>
+      </w:pPr>
+      <w:r/>
+      <w:r>
+        <w:rPr>
+          <w:b/>
+        </w:rPr>
+        <w:t>High-Density SaaS Grid (Retool/Linear Style)</w:t>
+      </w:r>
+      <w:r>
+        <w:t>: Dispatchers manage tens to hundreds of live vehicles simultaneously. Every screen pixel is utilized with tight padding (`py-2.5`), compact headers (`h-8`), and `text-xs` typography to prevent excessive vertical scrolling.</w:t>
+      </w:r>
+    </w:p>
+    <w:p>
+      <w:pPr>
+        <w:pStyle w:val="ListBullet"/>
+        <w:spacing w:before="20" w:after="40"/>
+      </w:pPr>
+      <w:r/>
+      <w:r>
+        <w:rPr>
+          <w:b/>
+        </w:rPr>
+        <w:t>Monochromatic Slate Foundation</w:t>
+      </w:r>
+      <w:r>
+        <w:t>: Built on `bg-white` cards with `bg-slate-50` backdrop, `border-slate-200`, and `text-slate-800` typography. High saturation colors are strictly reserved for operational exceptions (e.g. amber for `Delayed` trips, red for cash deficits).</w:t>
+      </w:r>
+    </w:p>
+    <w:p>
+      <w:pPr>
+        <w:pStyle w:val="ListBullet"/>
+        <w:spacing w:before="20" w:after="40"/>
+      </w:pPr>
+      <w:r/>
+      <w:r>
+        <w:rPr>
+          <w:b/>
+        </w:rPr>
+        <w:t>Tabular Monospace Alignment</w:t>
+      </w:r>
+      <w:r>
+        <w:t>: Registration numbers (`MH 12 RN 4920`), odometers (`142,380 km`), and currency figures utilize monospace font variants (`font-mono`) to guarantee vertical decimal alignment for rapid visual auditing.</w:t>
+      </w:r>
+    </w:p>
+    <w:p>
+      <w:pPr>
+        <w:pStyle w:val="Heading2"/>
+        <w:spacing w:before="200" w:after="40"/>
+      </w:pPr>
+      <w:r>
+        <w:rPr>
+          <w:rFonts w:ascii="Calibri" w:hAnsi="Calibri"/>
+          <w:b/>
+          <w:color w:val="334155"/>
+          <w:sz w:val="25"/>
+        </w:rPr>
+        <w:t>1.3 Key Features &amp; Components</w:t>
+      </w:r>
+    </w:p>
+    <w:p>
+      <w:pPr>
+        <w:spacing w:before="40" w:after="40"/>
+        <w:ind w:left="360"/>
+      </w:pPr>
+      <w:r>
+        <w:rPr>
+          <w:b/>
+        </w:rPr>
+        <w:t xml:space="preserve">1. </w:t>
+      </w:r>
+      <w:r/>
+      <w:r>
+        <w:rPr>
+          <w:b/>
+        </w:rPr>
+        <w:t>Collapsible Operational Left Sidebar</w:t>
+      </w:r>
+      <w:r>
+        <w:t>: Fixed-width navigation with company branding (`VECTO LOGISTICS - POD-TO-CASH ENGINE`), active shift profile (`DIS-04 - Bhiwandi Hub #4`), and system health indicator (`ISO-28000 / POD-2PL Synced`).</w:t>
+      </w:r>
+    </w:p>
+    <w:p>
+      <w:pPr>
+        <w:spacing w:before="40" w:after="40"/>
+        <w:ind w:left="360"/>
+      </w:pPr>
+      <w:r>
+        <w:rPr>
+          <w:b/>
+        </w:rPr>
+        <w:t xml:space="preserve">2. </w:t>
+      </w:r>
+      <w:r/>
+      <w:r>
+        <w:rPr>
+          <w:b/>
+        </w:rPr>
+        <w:t>Top Operational Header</w:t>
+      </w:r>
+      <w:r>
+        <w:t>: Search input with real-time substring filtering across Vehicle Reg No, Driver Name, Destination, and Trip ID; simulated shift/date picker (`02-Oct-2026 (Shift 1)`); and live fleet metric pill (`Active | Delayed | Total Fleet`).</w:t>
+      </w:r>
+    </w:p>
+    <w:p>
+      <w:pPr>
+        <w:spacing w:before="40" w:after="40"/>
+        <w:ind w:left="360"/>
+      </w:pPr>
+      <w:r>
+        <w:rPr>
+          <w:b/>
+        </w:rPr>
+        <w:t xml:space="preserve">3. </w:t>
+      </w:r>
+      <w:r/>
+      <w:r>
+        <w:rPr>
+          <w:b/>
+        </w:rPr>
+        <w:t>Executive KPI Strip</w:t>
+      </w:r>
+      <w:r>
+        <w:t xml:space="preserve">: 4 compact summary cards tracking </w:t>
+      </w:r>
+      <w:r>
+        <w:rPr>
+          <w:b/>
+        </w:rPr>
+        <w:t>Live Dispatched</w:t>
+      </w:r>
+      <w:r>
+        <w:t xml:space="preserve">, </w:t>
+      </w:r>
+      <w:r>
+        <w:rPr>
+          <w:b/>
+        </w:rPr>
+        <w:t>Expected COD Inbound (₹)</w:t>
+      </w:r>
+      <w:r>
+        <w:t xml:space="preserve">, </w:t>
+      </w:r>
+      <w:r>
+        <w:rPr>
+          <w:b/>
+        </w:rPr>
+        <w:t>Dispatched Advances (₹)</w:t>
+      </w:r>
+      <w:r>
+        <w:t xml:space="preserve">, and </w:t>
+      </w:r>
+      <w:r>
+        <w:rPr>
+          <w:b/>
+        </w:rPr>
+        <w:t>Pending EOD Audit</w:t>
+      </w:r>
+      <w:r>
+        <w:t>.</w:t>
+      </w:r>
+    </w:p>
+    <w:p>
+      <w:pPr>
+        <w:spacing w:before="40" w:after="40"/>
+        <w:ind w:left="360"/>
+      </w:pPr>
+      <w:r>
+        <w:rPr>
+          <w:b/>
+        </w:rPr>
+        <w:t xml:space="preserve">4. </w:t>
+      </w:r>
+      <w:r/>
+      <w:r>
+        <w:rPr>
+          <w:b/>
+        </w:rPr>
+        <w:t>Live Vehicle &amp; Trip Grid (`&lt;Table&gt;`, `&lt;Card&gt;`)</w:t>
+      </w:r>
+      <w:r>
+        <w:t>: Displays Vehicle Reg No, Driver Contact, Destination Corridor, Start/Current Odometer, Trip Status badge (`In Transit`, `Unloading`, `Delayed`), and action buttons:</w:t>
+      </w:r>
+    </w:p>
+    <w:p>
+      <w:pPr>
+        <w:pStyle w:val="ListBullet"/>
+        <w:spacing w:before="20" w:after="40"/>
+      </w:pPr>
+      <w:r/>
+      <w:r>
+        <w:rPr>
+          <w:b/>
+        </w:rPr>
+        <w:t>"Log Expense"</w:t>
+      </w:r>
+      <w:r>
+        <w:t>: Initiates interim expense logging.</w:t>
+      </w:r>
+    </w:p>
+    <w:p>
+      <w:pPr>
+        <w:pStyle w:val="ListBullet"/>
+        <w:spacing w:before="20" w:after="40"/>
+      </w:pPr>
+      <w:r/>
+      <w:r>
+        <w:rPr>
+          <w:b/>
+        </w:rPr>
+        <w:t>"Close Trip"</w:t>
+      </w:r>
+      <w:r>
+        <w:t>: Triggers full trip reconciliation.</w:t>
+      </w:r>
+    </w:p>
+    <w:p>
+      <w:pPr>
+        <w:spacing w:before="40" w:after="40"/>
+        <w:ind w:left="360"/>
+      </w:pPr>
+      <w:r>
+        <w:rPr>
+          <w:b/>
+        </w:rPr>
+        <w:t xml:space="preserve">5. </w:t>
+      </w:r>
+      <w:r/>
+      <w:r>
+        <w:rPr>
+          <w:b/>
+        </w:rPr>
+        <w:t>EOD Cash &amp; Expense Modal (`&lt;Dialog&gt;`)</w:t>
+      </w:r>
+      <w:r>
+        <w:t>: Form input fields for FASTag tolls, driver daily allowance (bhatta), emergency fuel slips, and total COD collected.</w:t>
+      </w:r>
+    </w:p>
+    <w:p>
+      <w:pPr>
+        <w:pStyle w:val="Heading2"/>
+        <w:spacing w:before="200" w:after="40"/>
+      </w:pPr>
+      <w:r>
+        <w:rPr>
+          <w:rFonts w:ascii="Calibri" w:hAnsi="Calibri"/>
+          <w:b/>
+          <w:color w:val="334155"/>
+          <w:sz w:val="25"/>
+        </w:rPr>
+        <w:t>1.4 State &amp; Data Flow (Frontend Logic)</w:t>
+      </w:r>
+    </w:p>
+    <w:p>
+      <w:pPr>
+        <w:pStyle w:val="ListBullet"/>
+        <w:spacing w:before="20" w:after="40"/>
+      </w:pPr>
+      <w:r/>
+      <w:r>
+        <w:rPr>
+          <w:b/>
+        </w:rPr>
+        <w:t>Real-time Filter &amp; Search State</w:t>
+      </w:r>
+      <w:r>
+        <w:t>: Driven by `searchQuery` and `selectedStatusFilter` hooks feeding a memoized `useMemo` pipeline that filters `INITIAL_FLEET_DATA` without server round-trips.</w:t>
+      </w:r>
+    </w:p>
+    <w:p>
+      <w:pPr>
+        <w:pStyle w:val="ListBullet"/>
+        <w:spacing w:before="20" w:after="40"/>
+      </w:pPr>
+      <w:r/>
+      <w:r>
+        <w:rPr>
+          <w:b/>
+        </w:rPr>
+        <w:t>EOD Tally Mathematical Model</w:t>
+      </w:r>
+      <w:r>
+        <w:t>: When the modal opens for trip $T$, it computes:</w:t>
+      </w:r>
+    </w:p>
+    <w:p>
+      <w:pPr>
+        <w:spacing w:before="40" w:after="80"/>
+      </w:pPr>
+      <w:r>
+        <w:t>$$\text{Total Expenses } (E) = \text{Toll} + \text{Allowance} + \text{Fuel}$$</w:t>
+      </w:r>
+    </w:p>
+    <w:p>
+      <w:pPr>
+        <w:spacing w:before="40" w:after="80"/>
+      </w:pPr>
+      <w:r>
+        <w:t>$$\text{Advance Balance } (B) = \text{Trip Advance} - E$$</w:t>
+      </w:r>
+    </w:p>
+    <w:p>
+      <w:pPr>
+        <w:spacing w:before="40" w:after="80"/>
+      </w:pPr>
+      <w:r>
+        <w:t>$$\text{Net Expected Remittance } (R_{\text{expected}}) = \text{Expected COD} + B$$</w:t>
+      </w:r>
+    </w:p>
+    <w:p>
+      <w:pPr>
+        <w:spacing w:before="40" w:after="80"/>
+      </w:pPr>
+      <w:r>
+        <w:t>$$\text{Discrepancy } (\Delta) = \text{Actual Cash Collected} - R_{\text{expected}}$$</w:t>
+      </w:r>
+    </w:p>
+    <w:p>
+      <w:pPr>
+        <w:pStyle w:val="ListBullet"/>
+        <w:spacing w:before="20" w:after="40"/>
+      </w:pPr>
+      <w:r/>
+      <w:r>
+        <w:rPr>
+          <w:b/>
+        </w:rPr>
+        <w:t>Discrepancy Visual Feedback</w:t>
+      </w:r>
+      <w:r>
+        <w:t>: A dynamic conditional container highlights:</w:t>
+      </w:r>
+    </w:p>
+    <w:p>
+      <w:pPr>
+        <w:pStyle w:val="ListBullet"/>
+        <w:spacing w:before="20" w:after="40"/>
+      </w:pPr>
+      <w:r>
+        <w:t>$\Delta = 0$: `bg-emerald-50` "Balanced (Zero Discrepancy)"</w:t>
+      </w:r>
+    </w:p>
+    <w:p>
+      <w:pPr>
+        <w:pStyle w:val="ListBullet"/>
+        <w:spacing w:before="20" w:after="40"/>
+      </w:pPr>
+      <w:r>
+        <w:t>$\Delta &gt; 0$: `bg-blue-50` "Surplus Cash (+₹$\Delta$)"</w:t>
+      </w:r>
+    </w:p>
+    <w:p>
+      <w:pPr>
+        <w:pStyle w:val="ListBullet"/>
+        <w:spacing w:before="20" w:after="40"/>
+      </w:pPr>
+      <w:r>
+        <w:t>$\Delta &lt; 0$: `bg-red-50` "Deficit / Shortage Action Required (-₹$|\Delta|$)"</w:t>
+      </w:r>
+    </w:p>
+    <w:p>
+      <w:pPr>
+        <w:spacing w:before="120" w:after="120"/>
+      </w:pPr>
+      <w:r>
+        <w:rPr>
+          <w:color w:val="CBD5E1"/>
+          <w:sz w:val="16"/>
+        </w:rPr>
+        <w:t>_______________________________________________________________________________</w:t>
+      </w:r>
+    </w:p>
+    <w:p>
+      <w:pPr>
+        <w:pStyle w:val="Heading1"/>
+        <w:spacing w:before="280" w:after="80"/>
+      </w:pPr>
+      <w:r>
+        <w:rPr>
+          <w:rFonts w:ascii="Calibri" w:hAnsi="Calibri"/>
+          <w:b/>
+          <w:color w:val="1E3A8A"/>
+          <w:sz w:val="32"/>
+        </w:rPr>
+        <w:t>2. Driver Mobile-Web App (`/driver`)</w:t>
+      </w:r>
+    </w:p>
+    <w:p>
+      <w:pPr>
+        <w:pStyle w:val="Heading2"/>
+        <w:spacing w:before="200" w:after="40"/>
+      </w:pPr>
+      <w:r>
+        <w:rPr>
+          <w:rFonts w:ascii="Calibri" w:hAnsi="Calibri"/>
+          <w:b/>
+          <w:color w:val="334155"/>
+          <w:sz w:val="25"/>
+        </w:rPr>
+        <w:t>2.1 Core Objective</w:t>
+      </w:r>
+    </w:p>
+    <w:p>
+      <w:pPr>
+        <w:spacing w:before="40" w:after="80"/>
+      </w:pPr>
+      <w:r>
+        <w:t>To provide long-haul and hub-and-spoke truck drivers with an outdoor-glare-resistant, touch-optimized mobile interface to navigate delivery stops, capture physical Lorry Receipts (LR), record receiver digital signatures, and collect COD remittances.</w:t>
+      </w:r>
+    </w:p>
+    <w:p>
+      <w:pPr>
+        <w:pStyle w:val="Heading2"/>
+        <w:spacing w:before="200" w:after="40"/>
+      </w:pPr>
+      <w:r>
+        <w:rPr>
+          <w:rFonts w:ascii="Calibri" w:hAnsi="Calibri"/>
+          <w:b/>
+          <w:color w:val="334155"/>
+          <w:sz w:val="25"/>
+        </w:rPr>
+        <w:t>2.2 Architectural &amp; UI/UX Design Rationale</w:t>
+      </w:r>
+    </w:p>
+    <w:p>
+      <w:pPr>
+        <w:pStyle w:val="ListBullet"/>
+        <w:spacing w:before="20" w:after="40"/>
+      </w:pPr>
+      <w:r/>
+      <w:r>
+        <w:rPr>
+          <w:b/>
+        </w:rPr>
+        <w:t>Centered Mobile-First Shell</w:t>
+      </w:r>
+      <w:r>
+        <w:t>: Wrapped in a constrained viewport container (`max-w-md mx-auto min-h-screen border-x border-slate-300 pb-24`) simulating native iOS/Android handheld operating behavior.</w:t>
+      </w:r>
+    </w:p>
+    <w:p>
+      <w:pPr>
+        <w:pStyle w:val="ListBullet"/>
+        <w:spacing w:before="20" w:after="40"/>
+      </w:pPr>
+      <w:r/>
+      <w:r>
+        <w:rPr>
+          <w:b/>
+        </w:rPr>
+        <w:t>Outdoor Glare &amp; Glove Optimization</w:t>
+      </w:r>
+      <w:r>
+        <w:t>: High-contrast dark status headers, bold high-contrast text (`text-slate-900`, `font-black`), stark 2px solid borders, and massive action buttons (`py-7`, `text-lg`) with high-visibility corporate blue (`bg-blue-700`) and emerald green (`bg-emerald-600`).</w:t>
+      </w:r>
+    </w:p>
+    <w:p>
+      <w:pPr>
+        <w:pStyle w:val="ListBullet"/>
+        <w:spacing w:before="20" w:after="40"/>
+      </w:pPr>
+      <w:r/>
+      <w:r>
+        <w:rPr>
+          <w:b/>
+        </w:rPr>
+        <w:t>Tactile Hierarchy</w:t>
+      </w:r>
+      <w:r>
+        <w:t>: Prevents accidental taps while driving by requiring deliberate thumb gestures on prominent touch zones.</w:t>
+      </w:r>
+    </w:p>
+    <w:p>
+      <w:pPr>
+        <w:pStyle w:val="Heading2"/>
+        <w:spacing w:before="200" w:after="40"/>
+      </w:pPr>
+      <w:r>
+        <w:rPr>
+          <w:rFonts w:ascii="Calibri" w:hAnsi="Calibri"/>
+          <w:b/>
+          <w:color w:val="334155"/>
+          <w:sz w:val="25"/>
+        </w:rPr>
+        <w:t>2.3 Key Features &amp; Components</w:t>
+      </w:r>
+    </w:p>
+    <w:p>
+      <w:pPr>
+        <w:spacing w:before="40" w:after="40"/>
+        <w:ind w:left="360"/>
+      </w:pPr>
+      <w:r>
+        <w:rPr>
+          <w:b/>
+        </w:rPr>
+        <w:t xml:space="preserve">1. </w:t>
+      </w:r>
+      <w:r/>
+      <w:r>
+        <w:rPr>
+          <w:b/>
+        </w:rPr>
+        <w:t>Rugged Device Status Header</w:t>
+      </w:r>
+      <w:r>
+        <w:t>: Duty toggle button ("Start Shift" / "End Shift"), live 4G LTE and battery indicators, vehicle registration badge (`MH 12 RN 4920 - 16T Eicher Pro`), and quick link to Dispatch UI.</w:t>
+      </w:r>
+    </w:p>
+    <w:p>
+      <w:pPr>
+        <w:spacing w:before="40" w:after="40"/>
+        <w:ind w:left="360"/>
+      </w:pPr>
+      <w:r>
+        <w:rPr>
+          <w:b/>
+        </w:rPr>
+        <w:t xml:space="preserve">2. </w:t>
+      </w:r>
+      <w:r/>
+      <w:r>
+        <w:rPr>
+          <w:b/>
+        </w:rPr>
+        <w:t>Current Active Delivery Card</w:t>
+      </w:r>
+      <w:r>
+        <w:t>: Displays primary destination (`Metro Cash &amp; Carry - Whitefield Distribution Hub`), client name, cargo specifications (`12 Pallets FMCG`, `3.8 Tonnes`, `₹24,500 COD`), and direct one-tap telephone dialer to the consignee gate manager.</w:t>
+      </w:r>
+    </w:p>
+    <w:p>
+      <w:pPr>
+        <w:spacing w:before="40" w:after="40"/>
+        <w:ind w:left="360"/>
+      </w:pPr>
+      <w:r>
+        <w:rPr>
+          <w:b/>
+        </w:rPr>
+        <w:t xml:space="preserve">3. </w:t>
+      </w:r>
+      <w:r/>
+      <w:r>
+        <w:rPr>
+          <w:b/>
+        </w:rPr>
+        <w:t>Simulated GPS Routing HUD</w:t>
+      </w:r>
+      <w:r>
+        <w:t>: Dark-mode GPS display showing speed (48 km/h), distance remaining (45 km), ETA countdown (52 mins), route corridor (NH-48 via Outer Ring Road), and turn-by-turn guidance.</w:t>
+      </w:r>
+    </w:p>
+    <w:p>
+      <w:pPr>
+        <w:spacing w:before="40" w:after="40"/>
+        <w:ind w:left="360"/>
+      </w:pPr>
+      <w:r>
+        <w:rPr>
+          <w:b/>
+        </w:rPr>
+        <w:t xml:space="preserve">4. </w:t>
+      </w:r>
+      <w:r/>
+      <w:r>
+        <w:rPr>
+          <w:b/>
+        </w:rPr>
+        <w:t>Up Next Stop Queue</w:t>
+      </w:r>
+      <w:r>
+        <w:t>: Preview cards for subsequent stops in the route (`Stop #2: Reliance Retail Central DC`, `Stop #3: Flipkart Wholesale Hub`) showing distance and load count.</w:t>
+      </w:r>
+    </w:p>
+    <w:p>
+      <w:pPr>
+        <w:spacing w:before="40" w:after="40"/>
+        <w:ind w:left="360"/>
+      </w:pPr>
+      <w:r>
+        <w:rPr>
+          <w:b/>
+        </w:rPr>
+        <w:t xml:space="preserve">5. </w:t>
+      </w:r>
+      <w:r/>
+      <w:r>
+        <w:rPr>
+          <w:b/>
+        </w:rPr>
+        <w:t>Digital POD &amp; Payment Collection Modal (`&lt;Dialog&gt;`)</w:t>
+      </w:r>
+      <w:r>
+        <w:t>: Full-screen modal housing:</w:t>
+      </w:r>
+    </w:p>
+    <w:p>
+      <w:pPr>
+        <w:pStyle w:val="ListBullet"/>
+        <w:spacing w:before="20" w:after="40"/>
+      </w:pPr>
+      <w:r/>
+      <w:r>
+        <w:rPr>
+          <w:b/>
+        </w:rPr>
+        <w:t>LR Photo Camera Dropzone</w:t>
+      </w:r>
+      <w:r>
+        <w:t>: Simulates physical camera capture with geotagging and preview/retake toggles.</w:t>
+      </w:r>
+    </w:p>
+    <w:p>
+      <w:pPr>
+        <w:pStyle w:val="ListBullet"/>
+        <w:spacing w:before="20" w:after="40"/>
+      </w:pPr>
+      <w:r/>
+      <w:r>
+        <w:rPr>
+          <w:b/>
+        </w:rPr>
+        <w:t>HTML5 Canvas "Sign on Glass"</w:t>
+      </w:r>
+      <w:r>
+        <w:t>: Touch/mouse interactive signature capture allowing finger signatures with clear reset.</w:t>
+      </w:r>
+    </w:p>
+    <w:p>
+      <w:pPr>
+        <w:pStyle w:val="ListBullet"/>
+        <w:spacing w:before="20" w:after="40"/>
+      </w:pPr>
+      <w:r/>
+      <w:r>
+        <w:rPr>
+          <w:b/>
+        </w:rPr>
+        <w:t>COD Payment Method Toggle</w:t>
+      </w:r>
+      <w:r>
+        <w:t xml:space="preserve">: High-contrast radio toggle between </w:t>
+      </w:r>
+      <w:r>
+        <w:rPr>
+          <w:b/>
+        </w:rPr>
+        <w:t>Cash</w:t>
+      </w:r>
+      <w:r>
+        <w:t xml:space="preserve"> and </w:t>
+      </w:r>
+      <w:r>
+        <w:rPr>
+          <w:b/>
+        </w:rPr>
+        <w:t>UPI QR</w:t>
+      </w:r>
+      <w:r>
+        <w:t xml:space="preserve"> (with truck UPI ID preview) and exact remittance number input.</w:t>
+      </w:r>
+    </w:p>
+    <w:p>
+      <w:pPr>
+        <w:pStyle w:val="Heading2"/>
+        <w:spacing w:before="200" w:after="40"/>
+      </w:pPr>
+      <w:r>
+        <w:rPr>
+          <w:rFonts w:ascii="Calibri" w:hAnsi="Calibri"/>
+          <w:b/>
+          <w:color w:val="334155"/>
+          <w:sz w:val="25"/>
+        </w:rPr>
+        <w:t>2.4 State &amp; Data Flow (Frontend Logic)</w:t>
+      </w:r>
+    </w:p>
+    <w:p>
+      <w:pPr>
+        <w:pStyle w:val="ListBullet"/>
+        <w:spacing w:before="20" w:after="40"/>
+      </w:pPr>
+      <w:r/>
+      <w:r>
+        <w:rPr>
+          <w:b/>
+        </w:rPr>
+        <w:t>Trip Stage Machine</w:t>
+      </w:r>
+      <w:r>
+        <w:t>: State transitions between `"driving"` $\rightarrow$ `"arrived"` $\rightarrow$ `"completed"`. Tapping "Reached Destination" advances the button state to "Complete Delivery &amp; POD", which opens the POD modal.</w:t>
+      </w:r>
+    </w:p>
+    <w:p>
+      <w:pPr>
+        <w:pStyle w:val="ListBullet"/>
+        <w:spacing w:before="20" w:after="40"/>
+      </w:pPr>
+      <w:r/>
+      <w:r>
+        <w:rPr>
+          <w:b/>
+        </w:rPr>
+        <w:t>Canvas Touch Drawing State</w:t>
+      </w:r>
+      <w:r>
+        <w:t>: Managed via HTML5 2D Canvas context (`canvasRef`). Captures both `onTouchStart`/`onTouchMove` (mobile devices) and `onMouseDown`/`onMouseMove` (desktop browser emulation), setting `isSigned = true` upon stroke detection.</w:t>
+      </w:r>
+    </w:p>
+    <w:p>
+      <w:pPr>
+        <w:pStyle w:val="ListBullet"/>
+        <w:spacing w:before="20" w:after="40"/>
+      </w:pPr>
+      <w:r/>
+      <w:r>
+        <w:rPr>
+          <w:b/>
+        </w:rPr>
+        <w:t>Validation Gating</w:t>
+      </w:r>
+      <w:r>
+        <w:t>: Form submission validates that `hasCapturedPhoto` is true before committing; upon confirmation, a state alert confirms settlement and updates the active stop.</w:t>
+      </w:r>
+    </w:p>
+    <w:p>
+      <w:pPr>
+        <w:spacing w:before="120" w:after="120"/>
+      </w:pPr>
+      <w:r>
+        <w:rPr>
+          <w:color w:val="CBD5E1"/>
+          <w:sz w:val="16"/>
+        </w:rPr>
+        <w:t>_______________________________________________________________________________</w:t>
+      </w:r>
+    </w:p>
+    <w:p>
+      <w:pPr>
+        <w:pStyle w:val="Heading1"/>
+        <w:spacing w:before="280" w:after="80"/>
+      </w:pPr>
+      <w:r>
+        <w:rPr>
+          <w:rFonts w:ascii="Calibri" w:hAnsi="Calibri"/>
+          <w:b/>
+          <w:color w:val="1E3A8A"/>
+          <w:sz w:val="32"/>
+        </w:rPr>
+        <w:t>3. Internal Audit Workspace (`/audit`)</w:t>
+      </w:r>
+    </w:p>
+    <w:p>
+      <w:pPr>
+        <w:pStyle w:val="Heading2"/>
+        <w:spacing w:before="200" w:after="40"/>
+      </w:pPr>
+      <w:r>
+        <w:rPr>
+          <w:rFonts w:ascii="Calibri" w:hAnsi="Calibri"/>
+          <w:b/>
+          <w:color w:val="334155"/>
+          <w:sz w:val="25"/>
+        </w:rPr>
+        <w:t>3.1 Core Objective</w:t>
+      </w:r>
+    </w:p>
+    <w:p>
+      <w:pPr>
+        <w:spacing w:before="40" w:after="80"/>
+      </w:pPr>
+      <w:r>
+        <w:t>To enable secondary-level freight auditors to cross-verify physical delivery documents against telematics data, inspect consignee stamps and signatures, detect freight/toll variances, and either certify invoices for billing or log disputes.</w:t>
+      </w:r>
+    </w:p>
+    <w:p>
+      <w:pPr>
+        <w:pStyle w:val="Heading2"/>
+        <w:spacing w:before="200" w:after="40"/>
+      </w:pPr>
+      <w:r>
+        <w:rPr>
+          <w:rFonts w:ascii="Calibri" w:hAnsi="Calibri"/>
+          <w:b/>
+          <w:color w:val="334155"/>
+          <w:sz w:val="25"/>
+        </w:rPr>
+        <w:t>3.2 Architectural &amp; UI/UX Design Rationale</w:t>
+      </w:r>
+    </w:p>
+    <w:p>
+      <w:pPr>
+        <w:pStyle w:val="ListBullet"/>
+        <w:spacing w:before="20" w:after="40"/>
+      </w:pPr>
+      <w:r/>
+      <w:r>
+        <w:rPr>
+          <w:b/>
+        </w:rPr>
+        <w:t>50/50 Split-Pane Layout</w:t>
+      </w:r>
+      <w:r>
+        <w:t>: Eliminates tab-switching cognitive load by placing the physical document on the Left Pane and the digital system data on the Right Pane side-by-side.</w:t>
+      </w:r>
+    </w:p>
+    <w:p>
+      <w:pPr>
+        <w:pStyle w:val="ListBullet"/>
+        <w:spacing w:before="20" w:after="40"/>
+      </w:pPr>
+      <w:r/>
+      <w:r>
+        <w:rPr>
+          <w:b/>
+        </w:rPr>
+        <w:t>High-Density Verification Workspace</w:t>
+      </w:r>
+      <w:r>
+        <w:t>: Clean white cards, muted slate accents, and monospace financial/mileage comparisons designed for rapid verification throughput (&lt; 2 minutes per consignment).</w:t>
+      </w:r>
+    </w:p>
+    <w:p>
+      <w:pPr>
+        <w:pStyle w:val="Heading2"/>
+        <w:spacing w:before="200" w:after="40"/>
+      </w:pPr>
+      <w:r>
+        <w:rPr>
+          <w:rFonts w:ascii="Calibri" w:hAnsi="Calibri"/>
+          <w:b/>
+          <w:color w:val="334155"/>
+          <w:sz w:val="25"/>
+        </w:rPr>
+        <w:t>3.3 Key Features &amp; Components</w:t>
+      </w:r>
+    </w:p>
+    <w:p>
+      <w:pPr>
+        <w:spacing w:before="40" w:after="40"/>
+        <w:ind w:left="360"/>
+      </w:pPr>
+      <w:r>
+        <w:rPr>
+          <w:b/>
+        </w:rPr>
+        <w:t xml:space="preserve">1. </w:t>
+      </w:r>
+      <w:r/>
+      <w:r>
+        <w:rPr>
+          <w:b/>
+        </w:rPr>
+        <w:t>Interactive Document Viewer (Left Pane)</w:t>
+      </w:r>
+      <w:r>
+        <w:t>:</w:t>
+      </w:r>
+    </w:p>
+    <w:p>
+      <w:pPr>
+        <w:pStyle w:val="ListBullet"/>
+        <w:spacing w:before="20" w:after="40"/>
+      </w:pPr>
+      <w:r/>
+      <w:r>
+        <w:rPr>
+          <w:b/>
+        </w:rPr>
+        <w:t>Viewer Controls</w:t>
+      </w:r>
+      <w:r>
+        <w:t>: Interactive Zoom In (+25%), Zoom Out (-25%), Rotate 90° clockwise, and 1-click Reset.</w:t>
+      </w:r>
+    </w:p>
+    <w:p>
+      <w:pPr>
+        <w:pStyle w:val="ListBullet"/>
+        <w:spacing w:before="20" w:after="40"/>
+      </w:pPr>
+      <w:r/>
+      <w:r>
+        <w:rPr>
+          <w:b/>
+        </w:rPr>
+        <w:t>Digital LR Consignment Note Canvas</w:t>
+      </w:r>
+      <w:r>
+        <w:t>: Renders high-fidelity consignment metadata (Consignor, Consignee, Truck No, Material breakdown, gate inward timestamp, and physical warehouse stamp).</w:t>
+      </w:r>
+    </w:p>
+    <w:p>
+      <w:pPr>
+        <w:pStyle w:val="ListBullet"/>
+        <w:spacing w:before="20" w:after="40"/>
+      </w:pPr>
+      <w:r/>
+      <w:r>
+        <w:rPr>
+          <w:b/>
+        </w:rPr>
+        <w:t>Sign-on-Glass Digital Verification Sub-Panel</w:t>
+      </w:r>
+      <w:r>
+        <w:t>: Displays the cryptographic auth hash (`#a98f-44e2-9b01`), receiver signatory credentials, and dock GPS verification tag.</w:t>
+      </w:r>
+    </w:p>
+    <w:p>
+      <w:pPr>
+        <w:spacing w:before="40" w:after="40"/>
+        <w:ind w:left="360"/>
+      </w:pPr>
+      <w:r>
+        <w:rPr>
+          <w:b/>
+        </w:rPr>
+        <w:t xml:space="preserve">2. </w:t>
+      </w:r>
+      <w:r/>
+      <w:r>
+        <w:rPr>
+          <w:b/>
+        </w:rPr>
+        <w:t>Audit Telematics &amp; Financial Pane (Right Pane)</w:t>
+      </w:r>
+      <w:r>
+        <w:t>:</w:t>
+      </w:r>
+    </w:p>
+    <w:p>
+      <w:pPr>
+        <w:pStyle w:val="ListBullet"/>
+        <w:spacing w:before="20" w:after="40"/>
+      </w:pPr>
+      <w:r/>
+      <w:r>
+        <w:rPr>
+          <w:b/>
+        </w:rPr>
+        <w:t>Trip Details Card</w:t>
+      </w:r>
+      <w:r>
+        <w:t>: Driver/Vehicle metadata, departure vs. arrival timestamps, and System GPS vs. Odometer distance variance calculator.</w:t>
+      </w:r>
+    </w:p>
+    <w:p>
+      <w:pPr>
+        <w:pStyle w:val="ListBullet"/>
+        <w:spacing w:before="20" w:after="40"/>
+      </w:pPr>
+      <w:r/>
+      <w:r>
+        <w:rPr>
+          <w:b/>
+        </w:rPr>
+        <w:t>Financial Tally Table</w:t>
+      </w:r>
+      <w:r>
+        <w:t>: Line-item variance matrix comparing Driver Reported vs. System Policy amounts for Toll Payments, Fuel &amp; AdBlue, Driver Allowance, and Total COD Cash Remitted.</w:t>
+      </w:r>
+    </w:p>
+    <w:p>
+      <w:pPr>
+        <w:pStyle w:val="ListBullet"/>
+        <w:spacing w:before="20" w:after="40"/>
+      </w:pPr>
+      <w:r/>
+      <w:r>
+        <w:rPr>
+          <w:b/>
+        </w:rPr>
+        <w:t>Interactive 5-Gate Checklist</w:t>
+      </w:r>
+      <w:r>
+        <w:t>: Interactive checkboxes for:</w:t>
+      </w:r>
+    </w:p>
+    <w:p>
+      <w:pPr>
+        <w:spacing w:before="40" w:after="40"/>
+        <w:ind w:left="360"/>
+      </w:pPr>
+      <w:r>
+        <w:rPr>
+          <w:b/>
+        </w:rPr>
+        <w:t xml:space="preserve">1. </w:t>
+      </w:r>
+      <w:r>
+        <w:t>*Distance Match (GPS vs Odometer within ±3%)*</w:t>
+      </w:r>
+    </w:p>
+    <w:p>
+      <w:pPr>
+        <w:spacing w:before="40" w:after="40"/>
+        <w:ind w:left="360"/>
+      </w:pPr>
+      <w:r>
+        <w:rPr>
+          <w:b/>
+        </w:rPr>
+        <w:t xml:space="preserve">2. </w:t>
+      </w:r>
+      <w:r>
+        <w:t>*Cash Match (Remitted vs Expected COD)*</w:t>
+      </w:r>
+    </w:p>
+    <w:p>
+      <w:pPr>
+        <w:spacing w:before="40" w:after="40"/>
+        <w:ind w:left="360"/>
+      </w:pPr>
+      <w:r>
+        <w:rPr>
+          <w:b/>
+        </w:rPr>
+        <w:t xml:space="preserve">3. </w:t>
+      </w:r>
+      <w:r>
+        <w:t>*Signature Present (Valid glass sign captured)*</w:t>
+      </w:r>
+    </w:p>
+    <w:p>
+      <w:pPr>
+        <w:spacing w:before="40" w:after="40"/>
+        <w:ind w:left="360"/>
+      </w:pPr>
+      <w:r>
+        <w:rPr>
+          <w:b/>
+        </w:rPr>
+        <w:t xml:space="preserve">4. </w:t>
+      </w:r>
+      <w:r>
+        <w:t>*Consignee Stamp Verified (Official dock stamp legible)*</w:t>
+      </w:r>
+    </w:p>
+    <w:p>
+      <w:pPr>
+        <w:spacing w:before="40" w:after="40"/>
+        <w:ind w:left="360"/>
+      </w:pPr>
+      <w:r>
+        <w:rPr>
+          <w:b/>
+        </w:rPr>
+        <w:t xml:space="preserve">5. </w:t>
+      </w:r>
+      <w:r>
+        <w:t>*Document Legibility (Serials &amp; quantities verified)*</w:t>
+      </w:r>
+    </w:p>
+    <w:p>
+      <w:pPr>
+        <w:spacing w:before="40" w:after="40"/>
+        <w:ind w:left="360"/>
+      </w:pPr>
+      <w:r>
+        <w:rPr>
+          <w:b/>
+        </w:rPr>
+        <w:t xml:space="preserve">3. </w:t>
+      </w:r>
+      <w:r/>
+      <w:r>
+        <w:rPr>
+          <w:b/>
+        </w:rPr>
+        <w:t>Sticky Action Footer</w:t>
+      </w:r>
+      <w:r>
+        <w:t>:</w:t>
+      </w:r>
+    </w:p>
+    <w:p>
+      <w:pPr>
+        <w:pStyle w:val="ListBullet"/>
+        <w:spacing w:before="20" w:after="40"/>
+      </w:pPr>
+      <w:r/>
+      <w:r>
+        <w:rPr>
+          <w:b/>
+        </w:rPr>
+        <w:t>"Raise Discrepancy" (Red Outline)</w:t>
+      </w:r>
+      <w:r>
+        <w:t>: Triggers an audit dispute modal with justification textarea to freeze invoice generation.</w:t>
+      </w:r>
+    </w:p>
+    <w:p>
+      <w:pPr>
+        <w:pStyle w:val="ListBullet"/>
+        <w:spacing w:before="20" w:after="40"/>
+      </w:pPr>
+      <w:r/>
+      <w:r>
+        <w:rPr>
+          <w:b/>
+        </w:rPr>
+        <w:t>"Verify &amp; Send to Billing" (Dark Solid)</w:t>
+      </w:r>
+      <w:r>
+        <w:t>: Certifies the trip and transmits it to Accounts Payable.</w:t>
+      </w:r>
+    </w:p>
+    <w:p>
+      <w:pPr>
+        <w:pStyle w:val="Heading2"/>
+        <w:spacing w:before="200" w:after="40"/>
+      </w:pPr>
+      <w:r>
+        <w:rPr>
+          <w:rFonts w:ascii="Calibri" w:hAnsi="Calibri"/>
+          <w:b/>
+          <w:color w:val="334155"/>
+          <w:sz w:val="25"/>
+        </w:rPr>
+        <w:t>3.4 State &amp; Data Flow (Frontend Logic)</w:t>
+      </w:r>
+    </w:p>
+    <w:p>
+      <w:pPr>
+        <w:pStyle w:val="ListBullet"/>
+        <w:spacing w:before="20" w:after="40"/>
+      </w:pPr>
+      <w:r/>
+      <w:r>
+        <w:rPr>
+          <w:b/>
+        </w:rPr>
+        <w:t>Transform Matrix Manipulation</w:t>
+      </w:r>
+      <w:r>
+        <w:t>: `zoomLevel` and `rotation` states directly manipulate CSS `transform: scale(...) rotate(...)` on the document element with smooth CSS hardware acceleration.</w:t>
+      </w:r>
+    </w:p>
+    <w:p>
+      <w:pPr>
+        <w:pStyle w:val="ListBullet"/>
+        <w:spacing w:before="20" w:after="40"/>
+      </w:pPr>
+      <w:r/>
+      <w:r>
+        <w:rPr>
+          <w:b/>
+        </w:rPr>
+        <w:t>Multi-Trip Queue Switching</w:t>
+      </w:r>
+      <w:r>
+        <w:t>: State variable `selectedTripId` drives reactive memoization to swap active documents, telematics, and financial tables on demand (`TRIP-8842`, `TRIP-8841`, `TRIP-8846`).</w:t>
+      </w:r>
+    </w:p>
+    <w:p>
+      <w:pPr>
+        <w:pStyle w:val="ListBullet"/>
+        <w:spacing w:before="20" w:after="40"/>
+      </w:pPr>
+      <w:r/>
+      <w:r>
+        <w:rPr>
+          <w:b/>
+        </w:rPr>
+        <w:t>Checklist State Engine</w:t>
+      </w:r>
+      <w:r>
+        <w:t>: An object state dictionary `checklist` toggles between boolean passes (`CheckCircle2`) and failures (`XCircle`), dynamically updating row styles.</w:t>
+      </w:r>
+    </w:p>
+    <w:p>
+      <w:pPr>
+        <w:spacing w:before="120" w:after="120"/>
+      </w:pPr>
+      <w:r>
+        <w:rPr>
+          <w:color w:val="CBD5E1"/>
+          <w:sz w:val="16"/>
+        </w:rPr>
+        <w:t>_______________________________________________________________________________</w:t>
+      </w:r>
+    </w:p>
+    <w:p>
+      <w:pPr>
+        <w:pStyle w:val="Heading1"/>
+        <w:spacing w:before="280" w:after="80"/>
+      </w:pPr>
+      <w:r>
+        <w:rPr>
+          <w:rFonts w:ascii="Calibri" w:hAnsi="Calibri"/>
+          <w:b/>
+          <w:color w:val="1E3A8A"/>
+          <w:sz w:val="32"/>
+        </w:rPr>
+        <w:t>4. Logistics Accounts &amp; Billing (`/accounts`)</w:t>
+      </w:r>
+    </w:p>
+    <w:p>
+      <w:pPr>
+        <w:pStyle w:val="Heading2"/>
+        <w:spacing w:before="200" w:after="40"/>
+      </w:pPr>
+      <w:r>
+        <w:rPr>
+          <w:rFonts w:ascii="Calibri" w:hAnsi="Calibri"/>
+          <w:b/>
+          <w:color w:val="334155"/>
+          <w:sz w:val="25"/>
+        </w:rPr>
+        <w:t>4.1 Core Objective</w:t>
+      </w:r>
+    </w:p>
+    <w:p>
+      <w:pPr>
+        <w:spacing w:before="40" w:after="80"/>
+      </w:pPr>
+      <w:r>
+        <w:t>To allow the 3PL finance and billing team to pool audit-cleared trips, compute accessorial charges (toll, demurrage), calculate statutory Indian GST taxes (18% under SAC 996511), and generate consolidated tax invoices.</w:t>
+      </w:r>
+    </w:p>
+    <w:p>
+      <w:pPr>
+        <w:pStyle w:val="Heading2"/>
+        <w:spacing w:before="200" w:after="40"/>
+      </w:pPr>
+      <w:r>
+        <w:rPr>
+          <w:rFonts w:ascii="Calibri" w:hAnsi="Calibri"/>
+          <w:b/>
+          <w:color w:val="334155"/>
+          <w:sz w:val="25"/>
+        </w:rPr>
+        <w:t>4.2 Architectural &amp; UI/UX Design Rationale</w:t>
+      </w:r>
+    </w:p>
+    <w:p>
+      <w:pPr>
+        <w:pStyle w:val="ListBullet"/>
+        <w:spacing w:before="20" w:after="40"/>
+      </w:pPr>
+      <w:r/>
+      <w:r>
+        <w:rPr>
+          <w:b/>
+        </w:rPr>
+        <w:t>Tabular ERP Data Density</w:t>
+      </w:r>
+      <w:r>
+        <w:t>: Built for accounting clerks handling multi-trip consignment statements. Monospaced numeric alignment guarantees readability across high-value invoices.</w:t>
+      </w:r>
+    </w:p>
+    <w:p>
+      <w:pPr>
+        <w:pStyle w:val="ListBullet"/>
+        <w:spacing w:before="20" w:after="40"/>
+      </w:pPr>
+      <w:r/>
+      <w:r>
+        <w:rPr>
+          <w:b/>
+        </w:rPr>
+        <w:t>Dual-Tab Perspective</w:t>
+      </w:r>
+      <w:r>
+        <w:t>: Distinguishes between unbilled inventory (`Pending Billing`) and committed receivables (`Accounts Receivable Ledger`).</w:t>
+      </w:r>
+    </w:p>
+    <w:p>
+      <w:pPr>
+        <w:pStyle w:val="Heading2"/>
+        <w:spacing w:before="200" w:after="40"/>
+      </w:pPr>
+      <w:r>
+        <w:rPr>
+          <w:rFonts w:ascii="Calibri" w:hAnsi="Calibri"/>
+          <w:b/>
+          <w:color w:val="334155"/>
+          <w:sz w:val="25"/>
+        </w:rPr>
+        <w:t>4.3 Key Features &amp; Components</w:t>
+      </w:r>
+    </w:p>
+    <w:p>
+      <w:pPr>
+        <w:spacing w:before="40" w:after="40"/>
+        <w:ind w:left="360"/>
+      </w:pPr>
+      <w:r>
+        <w:rPr>
+          <w:b/>
+        </w:rPr>
+        <w:t xml:space="preserve">1. </w:t>
+      </w:r>
+      <w:r/>
+      <w:r>
+        <w:rPr>
+          <w:b/>
+        </w:rPr>
+        <w:t>Executive Accounts Header</w:t>
+      </w:r>
+      <w:r>
+        <w:t xml:space="preserve">: Search bar across Client, Invoice, and Trip ID, paired with real-time financial KPI metrics: </w:t>
+      </w:r>
+      <w:r>
+        <w:rPr>
+          <w:b/>
+        </w:rPr>
+        <w:t>Outstanding AR (₹12,50,000)</w:t>
+      </w:r>
+      <w:r>
+        <w:t xml:space="preserve">, </w:t>
+      </w:r>
+      <w:r>
+        <w:rPr>
+          <w:b/>
+        </w:rPr>
+        <w:t>Overdue (₹2,10,040)</w:t>
+      </w:r>
+      <w:r>
+        <w:t xml:space="preserve">, and </w:t>
+      </w:r>
+      <w:r>
+        <w:rPr>
+          <w:b/>
+        </w:rPr>
+        <w:t>Ready to Bill (₹2,08,500)</w:t>
+      </w:r>
+      <w:r>
+        <w:t>.</w:t>
+      </w:r>
+    </w:p>
+    <w:p>
+      <w:pPr>
+        <w:spacing w:before="40" w:after="40"/>
+        <w:ind w:left="360"/>
+      </w:pPr>
+      <w:r>
+        <w:rPr>
+          <w:b/>
+        </w:rPr>
+        <w:t xml:space="preserve">2. </w:t>
+      </w:r>
+      <w:r/>
+      <w:r>
+        <w:rPr>
+          <w:b/>
+        </w:rPr>
+        <w:t>Tab 1: Pending Billing (Unbilled Trips Queue)</w:t>
+      </w:r>
+      <w:r>
+        <w:t>:</w:t>
+      </w:r>
+    </w:p>
+    <w:p>
+      <w:pPr>
+        <w:pStyle w:val="ListBullet"/>
+        <w:spacing w:before="20" w:after="40"/>
+      </w:pPr>
+      <w:r>
+        <w:t>Multi-select checkboxes with a global "Select All" header toggle.</w:t>
+      </w:r>
+    </w:p>
+    <w:p>
+      <w:pPr>
+        <w:pStyle w:val="ListBullet"/>
+        <w:spacing w:before="20" w:after="40"/>
+      </w:pPr>
+      <w:r>
+        <w:t>Columns: Trip ID &amp; LR No, Client &amp; Consignee GSTIN, Route &amp; Delivery Date, Base Freight, Accessorial Charges (Toll + Demurrage breakdown), and Total Net Billable.</w:t>
+      </w:r>
+    </w:p>
+    <w:p>
+      <w:pPr>
+        <w:spacing w:before="40" w:after="40"/>
+        <w:ind w:left="360"/>
+      </w:pPr>
+      <w:r>
+        <w:rPr>
+          <w:b/>
+        </w:rPr>
+        <w:t xml:space="preserve">3. </w:t>
+      </w:r>
+      <w:r/>
+      <w:r>
+        <w:rPr>
+          <w:b/>
+        </w:rPr>
+        <w:t>Floating Sticky Bottom Action Bar</w:t>
+      </w:r>
+      <w:r>
+        <w:t>:</w:t>
+      </w:r>
+    </w:p>
+    <w:p>
+      <w:pPr>
+        <w:pStyle w:val="ListBullet"/>
+        <w:spacing w:before="20" w:after="40"/>
+      </w:pPr>
+      <w:r>
+        <w:t>Automatically slides up from the bottom when one or more rows are checked.</w:t>
+      </w:r>
+    </w:p>
+    <w:p>
+      <w:pPr>
+        <w:pStyle w:val="ListBullet"/>
+        <w:spacing w:before="20" w:after="40"/>
+      </w:pPr>
+      <w:r>
+        <w:t>Displays dynamic live counts: `X Trips Selected | Subtotal: ₹Y | Est. GST (18%): ₹Z | Grand Total: ₹W`.</w:t>
+      </w:r>
+    </w:p>
+    <w:p>
+      <w:pPr>
+        <w:pStyle w:val="ListBullet"/>
+        <w:spacing w:before="20" w:after="40"/>
+      </w:pPr>
+      <w:r>
+        <w:t>Action buttons: "Clear Selection" and "Generate Consolidated Invoice".</w:t>
+      </w:r>
+    </w:p>
+    <w:p>
+      <w:pPr>
+        <w:spacing w:before="40" w:after="40"/>
+        <w:ind w:left="360"/>
+      </w:pPr>
+      <w:r>
+        <w:rPr>
+          <w:b/>
+        </w:rPr>
+        <w:t xml:space="preserve">4. </w:t>
+      </w:r>
+      <w:r/>
+      <w:r>
+        <w:rPr>
+          <w:b/>
+        </w:rPr>
+        <w:t>Tab 2: Accounts Receivable Ledger</w:t>
+      </w:r>
+      <w:r>
+        <w:t>:</w:t>
+      </w:r>
+    </w:p>
+    <w:p>
+      <w:pPr>
+        <w:pStyle w:val="ListBullet"/>
+        <w:spacing w:before="20" w:after="40"/>
+      </w:pPr>
+      <w:r>
+        <w:t>Tracks published invoices, issuance/due dates, trip counts, subtotal, 18% GST, grand total, and payment status badges (`Paid`, `Pending`, `Overdue`).</w:t>
+      </w:r>
+    </w:p>
+    <w:p>
+      <w:pPr>
+        <w:pStyle w:val="ListBullet"/>
+        <w:spacing w:before="20" w:after="40"/>
+      </w:pPr>
+      <w:r>
+        <w:t>"Download PDF" action trigger for invoice archiving.</w:t>
+      </w:r>
+    </w:p>
+    <w:p>
+      <w:pPr>
+        <w:spacing w:before="40" w:after="40"/>
+        <w:ind w:left="360"/>
+      </w:pPr>
+      <w:r>
+        <w:rPr>
+          <w:b/>
+        </w:rPr>
+        <w:t xml:space="preserve">5. </w:t>
+      </w:r>
+      <w:r/>
+      <w:r>
+        <w:rPr>
+          <w:b/>
+        </w:rPr>
+        <w:t>Widget: Formal GST Tax Invoice Draft Generator (`&lt;Dialog&gt;`)</w:t>
+      </w:r>
+      <w:r>
+        <w:t>:</w:t>
+      </w:r>
+    </w:p>
+    <w:p>
+      <w:pPr>
+        <w:pStyle w:val="ListBullet"/>
+        <w:spacing w:before="20" w:after="40"/>
+      </w:pPr>
+      <w:r>
+        <w:t>Complies with Indian Rule 46 GST Tax Invoice specifications.</w:t>
+      </w:r>
+    </w:p>
+    <w:p>
+      <w:pPr>
+        <w:pStyle w:val="ListBullet"/>
+        <w:spacing w:before="20" w:after="40"/>
+      </w:pPr>
+      <w:r>
+        <w:t>Displays seller credentials (Vecto Logistics, GSTIN 27AABCV1234F1Z5, PAN, State Code 27) vs. client bill-to details (GSTIN, Address, Place of Supply Code 29).</w:t>
+      </w:r>
+    </w:p>
+    <w:p>
+      <w:pPr>
+        <w:pStyle w:val="ListBullet"/>
+        <w:spacing w:before="20" w:after="40"/>
+      </w:pPr>
+      <w:r>
+        <w:t>Itemized SAC 996511 freight consignment breakdown table.</w:t>
+      </w:r>
+    </w:p>
+    <w:p>
+      <w:pPr>
+        <w:pStyle w:val="ListBullet"/>
+        <w:spacing w:before="20" w:after="40"/>
+      </w:pPr>
+      <w:r>
+        <w:t>Remittance bank instructions (ICICI Bank A/C, IFSC Code, UPI VPA).</w:t>
+      </w:r>
+    </w:p>
+    <w:p>
+      <w:pPr>
+        <w:pStyle w:val="ListBullet"/>
+        <w:spacing w:before="20" w:after="40"/>
+      </w:pPr>
+      <w:r>
+        <w:t>Subtotal, 18% IGST calculation, and Grand Total with currency notation.</w:t>
+      </w:r>
+    </w:p>
+    <w:p>
+      <w:pPr>
+        <w:pStyle w:val="Heading2"/>
+        <w:spacing w:before="200" w:after="40"/>
+      </w:pPr>
+      <w:r>
+        <w:rPr>
+          <w:rFonts w:ascii="Calibri" w:hAnsi="Calibri"/>
+          <w:b/>
+          <w:color w:val="334155"/>
+          <w:sz w:val="25"/>
+        </w:rPr>
+        <w:t>4.4 State &amp; Data Flow (Frontend Logic)</w:t>
+      </w:r>
+    </w:p>
+    <w:p>
+      <w:pPr>
+        <w:pStyle w:val="ListBullet"/>
+        <w:spacing w:before="20" w:after="40"/>
+      </w:pPr>
+      <w:r/>
+      <w:r>
+        <w:rPr>
+          <w:b/>
+        </w:rPr>
+        <w:t>Multi-Selection Array State</w:t>
+      </w:r>
+      <w:r>
+        <w:t>: Managed via `selectedTripIds: string[]`. Toggling row checkboxes adds/removes IDs; header checkbox toggles all IDs in `filteredUnbilledTrips`.</w:t>
+      </w:r>
+    </w:p>
+    <w:p>
+      <w:pPr>
+        <w:pStyle w:val="ListBullet"/>
+        <w:spacing w:before="20" w:after="40"/>
+      </w:pPr>
+      <w:r/>
+      <w:r>
+        <w:rPr>
+          <w:b/>
+        </w:rPr>
+        <w:t>Dynamic GST Tax Math</w:t>
+      </w:r>
+      <w:r>
+        <w:t>:</w:t>
+      </w:r>
+    </w:p>
+    <w:p>
+      <w:pPr>
+        <w:spacing w:before="40" w:after="80"/>
+      </w:pPr>
+      <w:r>
+        <w:t>$$\text{Subtotal } (S) = \sum_{i \in \text{selected}} (\text{Freight}_i + \text{Toll}_i + \text{Demurrage}_i)$$</w:t>
+      </w:r>
+    </w:p>
+    <w:p>
+      <w:pPr>
+        <w:spacing w:before="40" w:after="80"/>
+      </w:pPr>
+      <w:r>
+        <w:t>$$\text{GST } (18\%) = \text{round}(S \times 0.18)$$</w:t>
+      </w:r>
+    </w:p>
+    <w:p>
+      <w:pPr>
+        <w:spacing w:before="40" w:after="80"/>
+      </w:pPr>
+      <w:r>
+        <w:t>$$\text{Grand Total } = S + \text{GST}$$</w:t>
+      </w:r>
+    </w:p>
+    <w:p>
+      <w:pPr>
+        <w:pStyle w:val="ListBullet"/>
+        <w:spacing w:before="20" w:after="40"/>
+      </w:pPr>
+      <w:r/>
+      <w:r>
+        <w:rPr>
+          <w:b/>
+        </w:rPr>
+        <w:t>Publishing Pipeline</w:t>
+      </w:r>
+      <w:r>
+        <w:t>: Submitting the draft generates a simulated invoice ID (`VEC-INV-2026-XXXX`), resets selection arrays, and posts an alert confirmation.</w:t>
+      </w:r>
+    </w:p>
+    <w:p>
+      <w:pPr>
+        <w:spacing w:before="120" w:after="120"/>
+      </w:pPr>
+      <w:r>
+        <w:rPr>
+          <w:color w:val="CBD5E1"/>
+          <w:sz w:val="16"/>
+        </w:rPr>
+        <w:t>_______________________________________________________________________________</w:t>
+      </w:r>
+    </w:p>
+    <w:p>
+      <w:pPr>
+        <w:pStyle w:val="Heading1"/>
+        <w:spacing w:before="280" w:after="80"/>
+      </w:pPr>
+      <w:r>
+        <w:rPr>
+          <w:rFonts w:ascii="Calibri" w:hAnsi="Calibri"/>
+          <w:b/>
+          <w:color w:val="1E3A8A"/>
+          <w:sz w:val="32"/>
+        </w:rPr>
+        <w:t>5. Client / Vendor Accounts Payable Portal (`/client-portal`)</w:t>
+      </w:r>
+    </w:p>
+    <w:p>
+      <w:pPr>
+        <w:pStyle w:val="Heading2"/>
+        <w:spacing w:before="200" w:after="40"/>
+      </w:pPr>
+      <w:r>
+        <w:rPr>
+          <w:rFonts w:ascii="Calibri" w:hAnsi="Calibri"/>
+          <w:b/>
+          <w:color w:val="334155"/>
+          <w:sz w:val="25"/>
+        </w:rPr>
+        <w:t>5.1 Core Objective</w:t>
+      </w:r>
+    </w:p>
+    <w:p>
+      <w:pPr>
+        <w:spacing w:before="40" w:after="80"/>
+      </w:pPr>
+      <w:r>
+        <w:t>An external, client-facing self-service portal for enterprise customers (e.g. Metro Cash &amp; Carry) to inspect inbound freight invoices, examine digital POD receipts, raise itemized line disputes, and approve settlements.</w:t>
+      </w:r>
+    </w:p>
+    <w:p>
+      <w:pPr>
+        <w:pStyle w:val="Heading2"/>
+        <w:spacing w:before="200" w:after="40"/>
+      </w:pPr>
+      <w:r>
+        <w:rPr>
+          <w:rFonts w:ascii="Calibri" w:hAnsi="Calibri"/>
+          <w:b/>
+          <w:color w:val="334155"/>
+          <w:sz w:val="25"/>
+        </w:rPr>
+        <w:t>5.2 Architectural &amp; UI/UX Design Rationale</w:t>
+      </w:r>
+    </w:p>
+    <w:p>
+      <w:pPr>
+        <w:pStyle w:val="ListBullet"/>
+        <w:spacing w:before="20" w:after="40"/>
+      </w:pPr>
+      <w:r/>
+      <w:r>
+        <w:rPr>
+          <w:b/>
+        </w:rPr>
+        <w:t>Differentiated Client Branding</w:t>
+      </w:r>
+      <w:r>
+        <w:t>: Features a light-slate/white sidebar with client corporate insignia (</w:t>
+      </w:r>
+      <w:r>
+        <w:rPr>
+          <w:b/>
+        </w:rPr>
+        <w:t>Metro Cash &amp; Carry</w:t>
+      </w:r>
+      <w:r>
+        <w:t>, Consignee ID `AP-IND-01`), establishing trust for an external portal.</w:t>
+      </w:r>
+    </w:p>
+    <w:p>
+      <w:pPr>
+        <w:pStyle w:val="ListBullet"/>
+        <w:spacing w:before="20" w:after="40"/>
+      </w:pPr>
+      <w:r/>
+      <w:r>
+        <w:rPr>
+          <w:b/>
+        </w:rPr>
+        <w:t>Non-Destructive Inline Dispute Design</w:t>
+      </w:r>
+      <w:r>
+        <w:t>: Rather than rejecting an entire invoice over a single damaged pallet, client managers can dispute specific line items while approving clean lines, preventing carrier cash flow disruption.</w:t>
+      </w:r>
+    </w:p>
+    <w:p>
+      <w:pPr>
+        <w:pStyle w:val="Heading2"/>
+        <w:spacing w:before="200" w:after="40"/>
+      </w:pPr>
+      <w:r>
+        <w:rPr>
+          <w:rFonts w:ascii="Calibri" w:hAnsi="Calibri"/>
+          <w:b/>
+          <w:color w:val="334155"/>
+          <w:sz w:val="25"/>
+        </w:rPr>
+        <w:t>5.3 Key Features &amp; Components</w:t>
+      </w:r>
+    </w:p>
+    <w:p>
+      <w:pPr>
+        <w:spacing w:before="40" w:after="40"/>
+        <w:ind w:left="360"/>
+      </w:pPr>
+      <w:r>
+        <w:rPr>
+          <w:b/>
+        </w:rPr>
+        <w:t xml:space="preserve">1. </w:t>
+      </w:r>
+      <w:r/>
+      <w:r>
+        <w:rPr>
+          <w:b/>
+        </w:rPr>
+        <w:t>Client AP Header</w:t>
+      </w:r>
+      <w:r>
+        <w:t>: Welcome banner (`Welcome, Metro Finance Team`), vendor reference (`Vecto Logistics India`), and financial metrics pill (`Total Outstanding: ₹94,105 | Due This Week: ₹31,270`).</w:t>
+      </w:r>
+    </w:p>
+    <w:p>
+      <w:pPr>
+        <w:spacing w:before="40" w:after="40"/>
+        <w:ind w:left="360"/>
+      </w:pPr>
+      <w:r>
+        <w:rPr>
+          <w:b/>
+        </w:rPr>
+        <w:t xml:space="preserve">2. </w:t>
+      </w:r>
+      <w:r/>
+      <w:r>
+        <w:rPr>
+          <w:b/>
+        </w:rPr>
+        <w:t>Invoice Inbox Grid</w:t>
+      </w:r>
+      <w:r>
+        <w:t>: Table displaying incoming freight invoices, issue dates, payment due dates, gross amounts, and status badges (`Pending Approval`, `Partially Disputed`, `Approved`, `Paid`).</w:t>
+      </w:r>
+    </w:p>
+    <w:p>
+      <w:pPr>
+        <w:spacing w:before="40" w:after="40"/>
+        <w:ind w:left="360"/>
+      </w:pPr>
+      <w:r>
+        <w:rPr>
+          <w:b/>
+        </w:rPr>
+        <w:t xml:space="preserve">3. </w:t>
+      </w:r>
+      <w:r/>
+      <w:r>
+        <w:rPr>
+          <w:b/>
+        </w:rPr>
+        <w:t>Invoice Deep-Dive Modal (`&lt;Dialog&gt;`)</w:t>
+      </w:r>
+      <w:r>
+        <w:t>:</w:t>
+      </w:r>
+    </w:p>
+    <w:p>
+      <w:pPr>
+        <w:pStyle w:val="ListBullet"/>
+        <w:spacing w:before="20" w:after="40"/>
+      </w:pPr>
+      <w:r>
+        <w:t>Wide modal displaying invoice header summary and an itemized breakdown of trips.</w:t>
+      </w:r>
+    </w:p>
+    <w:p>
+      <w:pPr>
+        <w:pStyle w:val="ListBullet"/>
+        <w:spacing w:before="20" w:after="40"/>
+      </w:pPr>
+      <w:r/>
+      <w:r>
+        <w:rPr>
+          <w:b/>
+        </w:rPr>
+        <w:t>"View POD" Action</w:t>
+      </w:r>
+      <w:r>
+        <w:t>: Expands a verified delivery card showing the warehouse gate dock stamp and the receiver's glass digital signature.</w:t>
+      </w:r>
+    </w:p>
+    <w:p>
+      <w:pPr>
+        <w:pStyle w:val="ListBullet"/>
+        <w:spacing w:before="20" w:after="40"/>
+      </w:pPr>
+      <w:r/>
+      <w:r>
+        <w:rPr>
+          <w:b/>
+        </w:rPr>
+        <w:t>Flag Dispute Action</w:t>
+      </w:r>
+      <w:r>
+        <w:t>: Flag icon button that opens the inline dispute drawer.</w:t>
+      </w:r>
+    </w:p>
+    <w:p>
+      <w:pPr>
+        <w:spacing w:before="40" w:after="40"/>
+        <w:ind w:left="360"/>
+      </w:pPr>
+      <w:r>
+        <w:rPr>
+          <w:b/>
+        </w:rPr>
+        <w:t xml:space="preserve">4. </w:t>
+      </w:r>
+      <w:r/>
+      <w:r>
+        <w:rPr>
+          <w:b/>
+        </w:rPr>
+        <w:t>Interactive Inline Dispute Drawer</w:t>
+      </w:r>
+      <w:r>
+        <w:t>:</w:t>
+      </w:r>
+    </w:p>
+    <w:p>
+      <w:pPr>
+        <w:pStyle w:val="ListBullet"/>
+        <w:spacing w:before="20" w:after="40"/>
+      </w:pPr>
+      <w:r>
+        <w:t>Expands seamlessly beneath the target consignment row.</w:t>
+      </w:r>
+    </w:p>
+    <w:p>
+      <w:pPr>
+        <w:pStyle w:val="ListBullet"/>
+        <w:spacing w:before="20" w:after="40"/>
+      </w:pPr>
+      <w:r>
+        <w:t>Dropdown selector for dispute grounds (*Damaged Goods in Transit*, *Late Delivery SLA Penalty*, *Missing Quantity / Shortage*, *Incorrect Demurrage / Waiting*, *POD Signature Missing*).</w:t>
+      </w:r>
+    </w:p>
+    <w:p>
+      <w:pPr>
+        <w:pStyle w:val="ListBullet"/>
+        <w:spacing w:before="20" w:after="40"/>
+      </w:pPr>
+      <w:r>
+        <w:t>Currency input for deduction amount (₹).</w:t>
+      </w:r>
+    </w:p>
+    <w:p>
+      <w:pPr>
+        <w:pStyle w:val="ListBullet"/>
+        <w:spacing w:before="20" w:after="40"/>
+      </w:pPr>
+      <w:r>
+        <w:t>Textarea for formal dispute justification and debit note cross-references.</w:t>
+      </w:r>
+    </w:p>
+    <w:p>
+      <w:pPr>
+        <w:pStyle w:val="ListBullet"/>
+        <w:spacing w:before="20" w:after="40"/>
+      </w:pPr>
+      <w:r>
+        <w:t>Real-time recalculation bar displaying Gross Invoice Amount, Disputed Deductions, and Authorized Net Payable.</w:t>
+      </w:r>
+    </w:p>
+    <w:p>
+      <w:pPr>
+        <w:spacing w:before="40" w:after="40"/>
+        <w:ind w:left="360"/>
+      </w:pPr>
+      <w:r>
+        <w:rPr>
+          <w:b/>
+        </w:rPr>
+        <w:t xml:space="preserve">5. </w:t>
+      </w:r>
+      <w:r/>
+      <w:r>
+        <w:rPr>
+          <w:b/>
+        </w:rPr>
+        <w:t>Approval Action Button</w:t>
+      </w:r>
+      <w:r>
+        <w:t>: Dynamically adapts its label based on dispute state:</w:t>
+      </w:r>
+    </w:p>
+    <w:p>
+      <w:pPr>
+        <w:pStyle w:val="ListBullet"/>
+        <w:spacing w:before="20" w:after="40"/>
+      </w:pPr>
+      <w:r>
+        <w:t>Without disputes: `"Approve Invoice for Payment"`</w:t>
+      </w:r>
+    </w:p>
+    <w:p>
+      <w:pPr>
+        <w:pStyle w:val="ListBullet"/>
+        <w:spacing w:before="20" w:after="40"/>
+      </w:pPr>
+      <w:r>
+        <w:t>With disputes: `"Approve with Debit Note (₹90,605)"`</w:t>
+      </w:r>
+    </w:p>
+    <w:p>
+      <w:pPr>
+        <w:pStyle w:val="Heading2"/>
+        <w:spacing w:before="200" w:after="40"/>
+      </w:pPr>
+      <w:r>
+        <w:rPr>
+          <w:rFonts w:ascii="Calibri" w:hAnsi="Calibri"/>
+          <w:b/>
+          <w:color w:val="334155"/>
+          <w:sz w:val="25"/>
+        </w:rPr>
+        <w:t>5.4 State &amp; Data Flow (Frontend Logic)</w:t>
+      </w:r>
+    </w:p>
+    <w:p>
+      <w:pPr>
+        <w:pStyle w:val="ListBullet"/>
+        <w:spacing w:before="20" w:after="40"/>
+      </w:pPr>
+      <w:r/>
+      <w:r>
+        <w:rPr>
+          <w:b/>
+        </w:rPr>
+        <w:t>Hierarchical Immutability</w:t>
+      </w:r>
+      <w:r>
+        <w:t>: Invoice line modifications update nested trip structures through immutable state mappings, ensuring parent table and modal metrics remain synchronized.</w:t>
+      </w:r>
+    </w:p>
+    <w:p>
+      <w:pPr>
+        <w:pStyle w:val="ListBullet"/>
+        <w:spacing w:before="20" w:after="40"/>
+      </w:pPr>
+      <w:r/>
+      <w:r>
+        <w:rPr>
+          <w:b/>
+        </w:rPr>
+        <w:t>Net Payable Calculation Engine</w:t>
+      </w:r>
+      <w:r>
+        <w:t>:</w:t>
+      </w:r>
+    </w:p>
+    <w:p>
+      <w:pPr>
+        <w:spacing w:before="40" w:after="80"/>
+      </w:pPr>
+      <w:r>
+        <w:t>$$\text{Net Payable Authorized} = \max\left(0, \text{Gross Amount} - \sum \text{Dispute Amounts}\right)$$</w:t>
+      </w:r>
+    </w:p>
+    <w:p>
+      <w:pPr>
+        <w:pStyle w:val="ListBullet"/>
+        <w:spacing w:before="20" w:after="40"/>
+      </w:pPr>
+      <w:r/>
+      <w:r>
+        <w:rPr>
+          <w:b/>
+        </w:rPr>
+        <w:t>Conditional Badge State</w:t>
+      </w:r>
+      <w:r>
+        <w:t>: When any line item contains `isDisputed: true`, the invoice status automatically updates from `"Pending Approval"` to `"Partially Disputed"`.</w:t>
+      </w:r>
+    </w:p>
+    <w:p>
+      <w:pPr>
+        <w:spacing w:before="120" w:after="120"/>
+      </w:pPr>
+      <w:r>
+        <w:rPr>
+          <w:color w:val="CBD5E1"/>
+          <w:sz w:val="16"/>
+        </w:rPr>
+        <w:t>_______________________________________________________________________________</w:t>
+      </w:r>
+    </w:p>
+    <w:p>
+      <w:pPr>
+        <w:pStyle w:val="Heading1"/>
+        <w:spacing w:before="280" w:after="80"/>
+      </w:pPr>
+      <w:r>
+        <w:rPr>
+          <w:rFonts w:ascii="Calibri" w:hAnsi="Calibri"/>
+          <w:b/>
+          <w:color w:val="1E3A8A"/>
+          <w:sz w:val="32"/>
+        </w:rPr>
+        <w:t>6. Authentication &amp; Route Guard Middleware (`/login` &amp; `middleware.ts`)</w:t>
+      </w:r>
+    </w:p>
+    <w:p>
+      <w:pPr>
+        <w:pStyle w:val="Heading2"/>
+        <w:spacing w:before="200" w:after="40"/>
+      </w:pPr>
+      <w:r>
+        <w:rPr>
+          <w:rFonts w:ascii="Calibri" w:hAnsi="Calibri"/>
+          <w:b/>
+          <w:color w:val="334155"/>
+          <w:sz w:val="25"/>
+        </w:rPr>
+        <w:t>6.1 Core Objective</w:t>
+      </w:r>
+    </w:p>
+    <w:p>
+      <w:pPr>
+        <w:spacing w:before="40" w:after="80"/>
+      </w:pPr>
+      <w:r>
+        <w:t>To secure the enterprise platform through edge-based session verification, control unauthenticated routing, and provide operational roles with rapid, persona-based access to their respective dashboards.</w:t>
+      </w:r>
+    </w:p>
+    <w:p>
+      <w:pPr>
+        <w:pStyle w:val="Heading2"/>
+        <w:spacing w:before="200" w:after="40"/>
+      </w:pPr>
+      <w:r>
+        <w:rPr>
+          <w:rFonts w:ascii="Calibri" w:hAnsi="Calibri"/>
+          <w:b/>
+          <w:color w:val="334155"/>
+          <w:sz w:val="25"/>
+        </w:rPr>
+        <w:t>6.2 Architectural &amp; Security Design Rationale</w:t>
+      </w:r>
+    </w:p>
+    <w:p>
+      <w:pPr>
+        <w:pStyle w:val="ListBullet"/>
+        <w:spacing w:before="20" w:after="40"/>
+      </w:pPr>
+      <w:r/>
+      <w:r>
+        <w:rPr>
+          <w:b/>
+        </w:rPr>
+        <w:t>Zero-Flash Edge Route Protection</w:t>
+      </w:r>
+      <w:r>
+        <w:t>: Next.js `middleware.ts` runs directly on edge workers ahead of page rendering. Unauthenticated HTTP requests to protected routes receive a clean `307 Temporary Redirect` before server component tree compilation begins, eliminating layout flashing or data leaks.</w:t>
+      </w:r>
+    </w:p>
+    <w:p>
+      <w:pPr>
+        <w:pStyle w:val="ListBullet"/>
+        <w:spacing w:before="20" w:after="40"/>
+      </w:pPr>
+      <w:r/>
+      <w:r>
+        <w:rPr>
+          <w:b/>
+        </w:rPr>
+        <w:t>Deep Linking Preservation</w:t>
+      </w:r>
+      <w:r>
+        <w:t>: When redirecting unauthenticated traffic to `/login`, the middleware appends the origin path as a query parameter (`/login?from=/accounts`), allowing seamless resumption post-login.</w:t>
+      </w:r>
+    </w:p>
+    <w:p>
+      <w:pPr>
+        <w:pStyle w:val="ListBullet"/>
+        <w:spacing w:before="20" w:after="40"/>
+      </w:pPr>
+      <w:r/>
+      <w:r>
+        <w:rPr>
+          <w:b/>
+        </w:rPr>
+        <w:t>Brute-Force &amp; Credential Stuffing Prevention</w:t>
+      </w:r>
+      <w:r>
+        <w:t>: The `/login` form implements client-side rate limiting that locks submission for 30 seconds upon 3 consecutive failed attempts, displaying an active countdown timer.</w:t>
+      </w:r>
+    </w:p>
+    <w:p>
+      <w:pPr>
+        <w:pStyle w:val="Heading2"/>
+        <w:spacing w:before="200" w:after="40"/>
+      </w:pPr>
+      <w:r>
+        <w:rPr>
+          <w:rFonts w:ascii="Calibri" w:hAnsi="Calibri"/>
+          <w:b/>
+          <w:color w:val="334155"/>
+          <w:sz w:val="25"/>
+        </w:rPr>
+        <w:t>6.3 Key Features &amp; Components</w:t>
+      </w:r>
+    </w:p>
+    <w:p>
+      <w:pPr>
+        <w:spacing w:before="40" w:after="40"/>
+        <w:ind w:left="360"/>
+      </w:pPr>
+      <w:r>
+        <w:rPr>
+          <w:b/>
+        </w:rPr>
+        <w:t xml:space="preserve">1. </w:t>
+      </w:r>
+      <w:r/>
+      <w:r>
+        <w:rPr>
+          <w:b/>
+        </w:rPr>
+        <w:t>SSO / Enterprise Credentials Form</w:t>
+      </w:r>
+      <w:r>
+        <w:t>:</w:t>
+      </w:r>
+    </w:p>
+    <w:p>
+      <w:pPr>
+        <w:pStyle w:val="ListBullet"/>
+        <w:spacing w:before="20" w:after="40"/>
+      </w:pPr>
+      <w:r>
+        <w:t>Email and password inputs with field-level validation and animated loading state (`&lt;Loader2&gt;`).</w:t>
+      </w:r>
+    </w:p>
+    <w:p>
+      <w:pPr>
+        <w:pStyle w:val="ListBullet"/>
+        <w:spacing w:before="20" w:after="40"/>
+      </w:pPr>
+      <w:r/>
+      <w:r>
+        <w:rPr>
+          <w:b/>
+        </w:rPr>
+        <w:t>Show / Hide Password Toggle</w:t>
+      </w:r>
+      <w:r>
+        <w:t>: Eye icon switcher preventing password masking errors.</w:t>
+      </w:r>
+    </w:p>
+    <w:p>
+      <w:pPr>
+        <w:pStyle w:val="ListBullet"/>
+        <w:spacing w:before="20" w:after="40"/>
+      </w:pPr>
+      <w:r/>
+      <w:r>
+        <w:rPr>
+          <w:b/>
+        </w:rPr>
+        <w:t>Hardware Caps Lock Detection</w:t>
+      </w:r>
+      <w:r>
+        <w:t>: Alert indicator warning users when Caps Lock is active during password entry.</w:t>
+      </w:r>
+    </w:p>
+    <w:p>
+      <w:pPr>
+        <w:pStyle w:val="ListBullet"/>
+        <w:spacing w:before="20" w:after="40"/>
+      </w:pPr>
+      <w:r/>
+      <w:r>
+        <w:rPr>
+          <w:b/>
+        </w:rPr>
+        <w:t>Remember Me</w:t>
+      </w:r>
+      <w:r>
+        <w:t>: Checkbox persisting authentication across sessions.</w:t>
+      </w:r>
+    </w:p>
+    <w:p>
+      <w:pPr>
+        <w:spacing w:before="40" w:after="40"/>
+        <w:ind w:left="360"/>
+      </w:pPr>
+      <w:r>
+        <w:rPr>
+          <w:b/>
+        </w:rPr>
+        <w:t xml:space="preserve">2. </w:t>
+      </w:r>
+      <w:r/>
+      <w:r>
+        <w:rPr>
+          <w:b/>
+        </w:rPr>
+        <w:t>Demo Persona Quick-Access Strip</w:t>
+      </w:r>
+      <w:r>
+        <w:t>:</w:t>
+      </w:r>
+    </w:p>
+    <w:p>
+      <w:pPr>
+        <w:pStyle w:val="ListBullet"/>
+        <w:spacing w:before="20" w:after="40"/>
+      </w:pPr>
+      <w:r>
+        <w:t xml:space="preserve">Instant preset chips for </w:t>
+      </w:r>
+      <w:r>
+        <w:rPr>
+          <w:b/>
+        </w:rPr>
+        <w:t>System Admin</w:t>
+      </w:r>
+      <w:r>
+        <w:t xml:space="preserve"> (`admin@vecto.com`), </w:t>
+      </w:r>
+      <w:r>
+        <w:rPr>
+          <w:b/>
+        </w:rPr>
+        <w:t>Dispatch Manager</w:t>
+      </w:r>
+      <w:r>
+        <w:t xml:space="preserve"> (`demo@vecto.com`), </w:t>
+      </w:r>
+      <w:r>
+        <w:rPr>
+          <w:b/>
+        </w:rPr>
+        <w:t>Finance Auditor</w:t>
+      </w:r>
+      <w:r>
+        <w:t xml:space="preserve"> (`audit@vecto.com`), </w:t>
+      </w:r>
+      <w:r>
+        <w:rPr>
+          <w:b/>
+        </w:rPr>
+        <w:t>Billing Specialist</w:t>
+      </w:r>
+      <w:r>
+        <w:t xml:space="preserve"> (`billing@vecto.com`), and </w:t>
+      </w:r>
+      <w:r>
+        <w:rPr>
+          <w:b/>
+        </w:rPr>
+        <w:t>Fleet Driver</w:t>
+      </w:r>
+      <w:r>
+        <w:t xml:space="preserve"> (`driver@vecto.com`).</w:t>
+      </w:r>
+    </w:p>
+    <w:p>
+      <w:pPr>
+        <w:pStyle w:val="ListBullet"/>
+        <w:spacing w:before="20" w:after="40"/>
+      </w:pPr>
+      <w:r>
+        <w:t>Clicking a persona automatically populates credentials, establishes the `vecto_access_token` session cookie, and navigates to the respective module.</w:t>
+      </w:r>
+    </w:p>
+    <w:p>
+      <w:pPr>
+        <w:spacing w:before="40" w:after="40"/>
+        <w:ind w:left="360"/>
+      </w:pPr>
+      <w:r>
+        <w:rPr>
+          <w:b/>
+        </w:rPr>
+        <w:t xml:space="preserve">3. </w:t>
+      </w:r>
+      <w:r/>
+      <w:r>
+        <w:rPr>
+          <w:b/>
+        </w:rPr>
+        <w:t>Session Cookie Management</w:t>
+      </w:r>
+      <w:r>
+        <w:t>: Sets `vecto_access_token=demo_session_token_&lt;timestamp&gt;; path=/; max-age=86400; SameSite=Lax`.</w:t>
+      </w:r>
+    </w:p>
+    <w:p>
+      <w:pPr>
+        <w:pStyle w:val="Heading2"/>
+        <w:spacing w:before="200" w:after="40"/>
+      </w:pPr>
+      <w:r>
+        <w:rPr>
+          <w:rFonts w:ascii="Calibri" w:hAnsi="Calibri"/>
+          <w:b/>
+          <w:color w:val="334155"/>
+          <w:sz w:val="25"/>
+        </w:rPr>
+        <w:t>6.4 State &amp; Data Flow (Frontend Logic)</w:t>
+      </w:r>
+    </w:p>
+    <w:p>
+      <w:pPr>
+        <w:pStyle w:val="ListBullet"/>
+        <w:spacing w:before="20" w:after="40"/>
+      </w:pPr>
+      <w:r/>
+      <w:r>
+        <w:rPr>
+          <w:b/>
+        </w:rPr>
+        <w:t>Authentication State Machine</w:t>
+      </w:r>
+      <w:r>
+        <w:t>: Tracks `idle` $\rightarrow$ `authenticating` $\rightarrow$ `authenticated` or `locked_out`.</w:t>
+      </w:r>
+    </w:p>
+    <w:p>
+      <w:pPr>
+        <w:pStyle w:val="ListBullet"/>
+        <w:spacing w:before="20" w:after="40"/>
+      </w:pPr>
+      <w:r/>
+      <w:r>
+        <w:rPr>
+          <w:b/>
+        </w:rPr>
+        <w:t>Lockout Timer</w:t>
+      </w:r>
+      <w:r>
+        <w:t>: An active `setInterval` decrements `lockoutTimer` from 30 to 0 seconds, disabling form submission while active.</w:t>
+      </w:r>
+    </w:p>
+    <w:p>
+      <w:pPr>
+        <w:spacing w:before="120" w:after="120"/>
+      </w:pPr>
+      <w:r>
+        <w:rPr>
+          <w:color w:val="CBD5E1"/>
+          <w:sz w:val="16"/>
+        </w:rPr>
+        <w:t>_______________________________________________________________________________</w:t>
+      </w:r>
+    </w:p>
+    <w:p>
+      <w:pPr>
+        <w:pStyle w:val="Heading1"/>
+        <w:spacing w:before="280" w:after="80"/>
+      </w:pPr>
+      <w:r>
+        <w:rPr>
+          <w:rFonts w:ascii="Calibri" w:hAnsi="Calibri"/>
+          <w:b/>
+          <w:color w:val="1E3A8A"/>
+          <w:sz w:val="32"/>
+        </w:rPr>
+        <w:t>7. User Invitation &amp; Password Policy Engine (`/invite/accept`)</w:t>
+      </w:r>
+    </w:p>
+    <w:p>
+      <w:pPr>
+        <w:pStyle w:val="Heading2"/>
+        <w:spacing w:before="200" w:after="40"/>
+      </w:pPr>
+      <w:r>
+        <w:rPr>
+          <w:rFonts w:ascii="Calibri" w:hAnsi="Calibri"/>
+          <w:b/>
+          <w:color w:val="334155"/>
+          <w:sz w:val="25"/>
+        </w:rPr>
+        <w:t>7.1 Core Objective</w:t>
+      </w:r>
+    </w:p>
+    <w:p>
+      <w:pPr>
+        <w:spacing w:before="40" w:after="80"/>
+      </w:pPr>
+      <w:r>
+        <w:t>To provide a secure onboarding interface where newly provisioned personnel arrive via an email invitation token to establish their corporate credentials in compliance with enterprise password security policies.</w:t>
+      </w:r>
+    </w:p>
+    <w:p>
+      <w:pPr>
+        <w:pStyle w:val="Heading2"/>
+        <w:spacing w:before="200" w:after="40"/>
+      </w:pPr>
+      <w:r>
+        <w:rPr>
+          <w:rFonts w:ascii="Calibri" w:hAnsi="Calibri"/>
+          <w:b/>
+          <w:color w:val="334155"/>
+          <w:sz w:val="25"/>
+        </w:rPr>
+        <w:t>7.2 Architectural &amp; UI/UX Design Rationale</w:t>
+      </w:r>
+    </w:p>
+    <w:p>
+      <w:pPr>
+        <w:pStyle w:val="ListBullet"/>
+        <w:spacing w:before="20" w:after="40"/>
+      </w:pPr>
+      <w:r/>
+      <w:r>
+        <w:rPr>
+          <w:b/>
+        </w:rPr>
+        <w:t>Zero-Distraction Onboarding Container</w:t>
+      </w:r>
+      <w:r>
+        <w:t>: Focused single-card container centered vertically on a clean slate background (`bg-slate-50`).</w:t>
+      </w:r>
+    </w:p>
+    <w:p>
+      <w:pPr>
+        <w:pStyle w:val="ListBullet"/>
+        <w:spacing w:before="20" w:after="40"/>
+      </w:pPr>
+      <w:r/>
+      <w:r>
+        <w:rPr>
+          <w:b/>
+        </w:rPr>
+        <w:t>Real-time 5-Point Policy Checklist</w:t>
+      </w:r>
+      <w:r>
+        <w:t>: Rather than waiting for a form submission error, users receive instantaneous real-time visual feedback against each password rule as they type.</w:t>
+      </w:r>
+    </w:p>
+    <w:p>
+      <w:pPr>
+        <w:pStyle w:val="Heading2"/>
+        <w:spacing w:before="200" w:after="40"/>
+      </w:pPr>
+      <w:r>
+        <w:rPr>
+          <w:rFonts w:ascii="Calibri" w:hAnsi="Calibri"/>
+          <w:b/>
+          <w:color w:val="334155"/>
+          <w:sz w:val="25"/>
+        </w:rPr>
+        <w:t>7.3 Key Features &amp; Components</w:t>
+      </w:r>
+    </w:p>
+    <w:p>
+      <w:pPr>
+        <w:spacing w:before="40" w:after="40"/>
+        <w:ind w:left="360"/>
+      </w:pPr>
+      <w:r>
+        <w:rPr>
+          <w:b/>
+        </w:rPr>
+        <w:t xml:space="preserve">1. </w:t>
+      </w:r>
+      <w:r/>
+      <w:r>
+        <w:rPr>
+          <w:b/>
+        </w:rPr>
+        <w:t>Token Authentication Header</w:t>
+      </w:r>
+      <w:r>
+        <w:t>: Checks the `?token=&lt;invite_token&gt;` parameter and displays the user's assigned organization role and corporate email.</w:t>
+      </w:r>
+    </w:p>
+    <w:p>
+      <w:pPr>
+        <w:spacing w:before="40" w:after="40"/>
+        <w:ind w:left="360"/>
+      </w:pPr>
+      <w:r>
+        <w:rPr>
+          <w:b/>
+        </w:rPr>
+        <w:t xml:space="preserve">2. </w:t>
+      </w:r>
+      <w:r/>
+      <w:r>
+        <w:rPr>
+          <w:b/>
+        </w:rPr>
+        <w:t>5-Point Dynamic Password Policy Validator</w:t>
+      </w:r>
+      <w:r>
+        <w:t>:</w:t>
+      </w:r>
+    </w:p>
+    <w:p>
+      <w:pPr>
+        <w:pStyle w:val="ListBullet"/>
+        <w:spacing w:before="20" w:after="40"/>
+      </w:pPr>
+      <w:r>
+        <w:t>Minimum 10 characters length (`password.length &gt;= 10`)</w:t>
+      </w:r>
+    </w:p>
+    <w:p>
+      <w:pPr>
+        <w:pStyle w:val="ListBullet"/>
+        <w:spacing w:before="20" w:after="40"/>
+      </w:pPr>
+      <w:r>
+        <w:t>At least 1 uppercase letter (`/[A-Z]/.test(password)`)</w:t>
+      </w:r>
+    </w:p>
+    <w:p>
+      <w:pPr>
+        <w:pStyle w:val="ListBullet"/>
+        <w:spacing w:before="20" w:after="40"/>
+      </w:pPr>
+      <w:r>
+        <w:t>At least 1 lowercase letter (`/[a-z]/.test(password)`)</w:t>
+      </w:r>
+    </w:p>
+    <w:p>
+      <w:pPr>
+        <w:pStyle w:val="ListBullet"/>
+        <w:spacing w:before="20" w:after="40"/>
+      </w:pPr>
+      <w:r>
+        <w:t>At least 1 numeric digit (`/[0-9]/.test(password)`)</w:t>
+      </w:r>
+    </w:p>
+    <w:p>
+      <w:pPr>
+        <w:pStyle w:val="ListBullet"/>
+        <w:spacing w:before="20" w:after="40"/>
+      </w:pPr>
+      <w:r>
+        <w:t>At least 1 special character (`/[!@#$%^&amp;*(),.?":{}|&lt;&gt;]/.test(password)`)</w:t>
+      </w:r>
+    </w:p>
+    <w:p>
+      <w:pPr>
+        <w:pStyle w:val="ListBullet"/>
+        <w:spacing w:before="20" w:after="40"/>
+      </w:pPr>
+      <w:r>
+        <w:t>Visual indicators transition between green checkmarks (`CheckCircle2`) and slate dots (`Circle`).</w:t>
+      </w:r>
+    </w:p>
+    <w:p>
+      <w:pPr>
+        <w:spacing w:before="40" w:after="40"/>
+        <w:ind w:left="360"/>
+      </w:pPr>
+      <w:r>
+        <w:rPr>
+          <w:b/>
+        </w:rPr>
+        <w:t xml:space="preserve">3. </w:t>
+      </w:r>
+      <w:r/>
+      <w:r>
+        <w:rPr>
+          <w:b/>
+        </w:rPr>
+        <w:t>Password Strength Meter</w:t>
+      </w:r>
+      <w:r>
+        <w:t>: Real-time progress bar computing score (0–5) with contextual color transitions (`Weak` in red, `Fair` in amber, `Good` in blue, `Strong` in emerald).</w:t>
+      </w:r>
+    </w:p>
+    <w:p>
+      <w:pPr>
+        <w:spacing w:before="40" w:after="40"/>
+        <w:ind w:left="360"/>
+      </w:pPr>
+      <w:r>
+        <w:rPr>
+          <w:b/>
+        </w:rPr>
+        <w:t xml:space="preserve">4. </w:t>
+      </w:r>
+      <w:r/>
+      <w:r>
+        <w:rPr>
+          <w:b/>
+        </w:rPr>
+        <w:t>Password Match Validation</w:t>
+      </w:r>
+      <w:r>
+        <w:t>: Confirms that "Confirm Password" strictly matches "New Password", displaying an inline warning upon mismatch.</w:t>
+      </w:r>
+    </w:p>
+    <w:p>
+      <w:pPr>
+        <w:spacing w:before="120" w:after="120"/>
+      </w:pPr>
+      <w:r>
+        <w:rPr>
+          <w:color w:val="CBD5E1"/>
+          <w:sz w:val="16"/>
+        </w:rPr>
+        <w:t>_______________________________________________________________________________</w:t>
+      </w:r>
+    </w:p>
+    <w:p>
+      <w:pPr>
+        <w:pStyle w:val="Heading1"/>
+        <w:spacing w:before="280" w:after="80"/>
+      </w:pPr>
+      <w:r>
+        <w:rPr>
+          <w:rFonts w:ascii="Calibri" w:hAnsi="Calibri"/>
+          <w:b/>
+          <w:color w:val="1E3A8A"/>
+          <w:sz w:val="32"/>
+        </w:rPr>
+        <w:t>8. Admin Master Data Management (`/admin`)</w:t>
+      </w:r>
+    </w:p>
+    <w:p>
+      <w:pPr>
+        <w:pStyle w:val="Heading2"/>
+        <w:spacing w:before="200" w:after="40"/>
+      </w:pPr>
+      <w:r>
+        <w:rPr>
+          <w:rFonts w:ascii="Calibri" w:hAnsi="Calibri"/>
+          <w:b/>
+          <w:color w:val="334155"/>
+          <w:sz w:val="25"/>
+        </w:rPr>
+        <w:t>8.1 Core Objective</w:t>
+      </w:r>
+    </w:p>
+    <w:p>
+      <w:pPr>
+        <w:spacing w:before="40" w:after="80"/>
+      </w:pPr>
+      <w:r>
+        <w:t>To provide platform administrators with a centralized control center to manage user permissions, activate/deactivate personnel, generate onboarding invitations, and maintain master data definitions (Vehicles, Drivers, Clients, and Freight Rate Cards).</w:t>
+      </w:r>
+    </w:p>
+    <w:p>
+      <w:pPr>
+        <w:pStyle w:val="Heading2"/>
+        <w:spacing w:before="200" w:after="40"/>
+      </w:pPr>
+      <w:r>
+        <w:rPr>
+          <w:rFonts w:ascii="Calibri" w:hAnsi="Calibri"/>
+          <w:b/>
+          <w:color w:val="334155"/>
+          <w:sz w:val="25"/>
+        </w:rPr>
+        <w:t>8.2 Architectural &amp; UI/UX Design Rationale</w:t>
+      </w:r>
+    </w:p>
+    <w:p>
+      <w:pPr>
+        <w:pStyle w:val="ListBullet"/>
+        <w:spacing w:before="20" w:after="40"/>
+      </w:pPr>
+      <w:r/>
+      <w:r>
+        <w:rPr>
+          <w:b/>
+        </w:rPr>
+        <w:t>High-Density ERP Administration</w:t>
+      </w:r>
+      <w:r>
+        <w:t>: Retool/Linear-style compact layout maximizing information density for organizational directory management.</w:t>
+      </w:r>
+    </w:p>
+    <w:p>
+      <w:pPr>
+        <w:pStyle w:val="ListBullet"/>
+        <w:spacing w:before="20" w:after="40"/>
+      </w:pPr>
+      <w:r/>
+      <w:r>
+        <w:rPr>
+          <w:b/>
+        </w:rPr>
+        <w:t>Instant Inline Status Governance</w:t>
+      </w:r>
+      <w:r>
+        <w:t>: Direct toggle switches allowing instant deactivation of former employees or compromised accounts without navigating away from the table.</w:t>
+      </w:r>
+    </w:p>
+    <w:p>
+      <w:pPr>
+        <w:pStyle w:val="Heading2"/>
+        <w:spacing w:before="200" w:after="40"/>
+      </w:pPr>
+      <w:r>
+        <w:rPr>
+          <w:rFonts w:ascii="Calibri" w:hAnsi="Calibri"/>
+          <w:b/>
+          <w:color w:val="334155"/>
+          <w:sz w:val="25"/>
+        </w:rPr>
+        <w:t>8.3 Key Features &amp; Components</w:t>
+      </w:r>
+    </w:p>
+    <w:p>
+      <w:pPr>
+        <w:spacing w:before="40" w:after="40"/>
+        <w:ind w:left="360"/>
+      </w:pPr>
+      <w:r>
+        <w:rPr>
+          <w:b/>
+        </w:rPr>
+        <w:t xml:space="preserve">1. </w:t>
+      </w:r>
+      <w:r/>
+      <w:r>
+        <w:rPr>
+          <w:b/>
+        </w:rPr>
+        <w:t>Admin Master Navigation Sidebar</w:t>
+      </w:r>
+      <w:r>
+        <w:t>:</w:t>
+      </w:r>
+    </w:p>
+    <w:p>
+      <w:pPr>
+        <w:pStyle w:val="ListBullet"/>
+        <w:spacing w:before="20" w:after="40"/>
+      </w:pPr>
+      <w:r>
+        <w:t>Left navigation menu: *Users &amp; Roles* (Active Default), *Vehicles*, *Drivers*, *Clients &amp; Vendors*, *Rate Cards*, *Security &amp; Audit Logs*, and *System Config*.</w:t>
+      </w:r>
+    </w:p>
+    <w:p>
+      <w:pPr>
+        <w:spacing w:before="40" w:after="40"/>
+        <w:ind w:left="360"/>
+      </w:pPr>
+      <w:r>
+        <w:rPr>
+          <w:b/>
+        </w:rPr>
+        <w:t xml:space="preserve">2. </w:t>
+      </w:r>
+      <w:r/>
+      <w:r>
+        <w:rPr>
+          <w:b/>
+        </w:rPr>
+        <w:t>Users &amp; Roles Directory Table</w:t>
+      </w:r>
+      <w:r>
+        <w:t>:</w:t>
+      </w:r>
+    </w:p>
+    <w:p>
+      <w:pPr>
+        <w:pStyle w:val="ListBullet"/>
+        <w:spacing w:before="20" w:after="40"/>
+      </w:pPr>
+      <w:r>
+        <w:t>Displays User Profile (Avatar + Full Name), Work Email, Role Badge (`System Admin`, `Dispatch Manager`, `Finance Auditor`, `Billing Specialist`, `Fleet Driver`), Account Status (`Active` / `Deactivated`), Last Active Timestamp, and Action Menu.</w:t>
+      </w:r>
+    </w:p>
+    <w:p>
+      <w:pPr>
+        <w:pStyle w:val="ListBullet"/>
+        <w:spacing w:before="20" w:after="40"/>
+      </w:pPr>
+      <w:r/>
+      <w:r>
+        <w:rPr>
+          <w:b/>
+        </w:rPr>
+        <w:t>Inline Status Switch</w:t>
+      </w:r>
+      <w:r>
+        <w:t>: Interactive toggle switch updating active user permissions in place.</w:t>
+      </w:r>
+    </w:p>
+    <w:p>
+      <w:pPr>
+        <w:pStyle w:val="ListBullet"/>
+        <w:spacing w:before="20" w:after="40"/>
+      </w:pPr>
+      <w:r/>
+      <w:r>
+        <w:rPr>
+          <w:b/>
+        </w:rPr>
+        <w:t>Role Badges</w:t>
+      </w:r>
+      <w:r>
+        <w:t>: Color-coded badges indicating role authorization scope.</w:t>
+      </w:r>
+    </w:p>
+    <w:p>
+      <w:pPr>
+        <w:spacing w:before="40" w:after="40"/>
+        <w:ind w:left="360"/>
+      </w:pPr>
+      <w:r>
+        <w:rPr>
+          <w:b/>
+        </w:rPr>
+        <w:t xml:space="preserve">3. </w:t>
+      </w:r>
+      <w:r/>
+      <w:r>
+        <w:rPr>
+          <w:b/>
+        </w:rPr>
+        <w:t>Search &amp; Role Filter Bar</w:t>
+      </w:r>
+      <w:r>
+        <w:t>:</w:t>
+      </w:r>
+    </w:p>
+    <w:p>
+      <w:pPr>
+        <w:pStyle w:val="ListBullet"/>
+        <w:spacing w:before="20" w:after="40"/>
+      </w:pPr>
+      <w:r>
+        <w:t>Instant substring search matching user names, emails, and roles.</w:t>
+      </w:r>
+    </w:p>
+    <w:p>
+      <w:pPr>
+        <w:pStyle w:val="ListBullet"/>
+        <w:spacing w:before="20" w:after="40"/>
+      </w:pPr>
+      <w:r>
+        <w:t>Role selector filter to isolate specific team disciplines.</w:t>
+      </w:r>
+    </w:p>
+    <w:p>
+      <w:pPr>
+        <w:spacing w:before="40" w:after="40"/>
+        <w:ind w:left="360"/>
+      </w:pPr>
+      <w:r>
+        <w:rPr>
+          <w:b/>
+        </w:rPr>
+        <w:t xml:space="preserve">4. </w:t>
+      </w:r>
+      <w:r/>
+      <w:r>
+        <w:rPr>
+          <w:b/>
+        </w:rPr>
+        <w:t>Interactive "Invite User" Modal (`&lt;Dialog&gt;`)</w:t>
+      </w:r>
+      <w:r>
+        <w:t>:</w:t>
+      </w:r>
+    </w:p>
+    <w:p>
+      <w:pPr>
+        <w:pStyle w:val="ListBullet"/>
+        <w:spacing w:before="20" w:after="40"/>
+      </w:pPr>
+      <w:r>
+        <w:t>Form capturing Full Name, Corporate Email Address, and Role.</w:t>
+      </w:r>
+    </w:p>
+    <w:p>
+      <w:pPr>
+        <w:pStyle w:val="ListBullet"/>
+        <w:spacing w:before="20" w:after="40"/>
+      </w:pPr>
+      <w:r>
+        <w:t>Generates a cryptographic invitation token link (`/invite/accept?token=inv_...`).</w:t>
+      </w:r>
+    </w:p>
+    <w:p>
+      <w:pPr>
+        <w:pStyle w:val="ListBullet"/>
+        <w:spacing w:before="20" w:after="40"/>
+      </w:pPr>
+      <w:r/>
+      <w:r>
+        <w:rPr>
+          <w:b/>
+        </w:rPr>
+        <w:t>1-Click Copy Link</w:t>
+      </w:r>
+      <w:r>
+        <w:t>: Copies the generated URL to the system clipboard.</w:t>
+      </w:r>
+    </w:p>
+    <w:p>
+      <w:pPr>
+        <w:pStyle w:val="ListBullet"/>
+        <w:spacing w:before="20" w:after="40"/>
+      </w:pPr>
+      <w:r>
+        <w:t>Appends the new user record to the live directory in an active state.</w:t>
+      </w:r>
+    </w:p>
+    <w:p>
+      <w:pPr>
+        <w:spacing w:before="40" w:after="40"/>
+        <w:ind w:left="360"/>
+      </w:pPr>
+      <w:r>
+        <w:rPr>
+          <w:b/>
+        </w:rPr>
+        <w:t xml:space="preserve">5. </w:t>
+      </w:r>
+      <w:r/>
+      <w:r>
+        <w:rPr>
+          <w:b/>
+        </w:rPr>
+        <w:t>Master Data Tabbed Views</w:t>
+      </w:r>
+      <w:r>
+        <w:t>:</w:t>
+      </w:r>
+    </w:p>
+    <w:p>
+      <w:pPr>
+        <w:pStyle w:val="ListBullet"/>
+        <w:spacing w:before="20" w:after="40"/>
+      </w:pPr>
+      <w:r/>
+      <w:r>
+        <w:rPr>
+          <w:b/>
+        </w:rPr>
+        <w:t>Vehicles</w:t>
+      </w:r>
+      <w:r>
+        <w:t>: Fleet registry tracking registration numbers, vehicle makes (Eicher Pro, Tata Signa), payload capacities, and telematics device IDs.</w:t>
+      </w:r>
+    </w:p>
+    <w:p>
+      <w:pPr>
+        <w:pStyle w:val="ListBullet"/>
+        <w:spacing w:before="20" w:after="40"/>
+      </w:pPr>
+      <w:r/>
+      <w:r>
+        <w:rPr>
+          <w:b/>
+        </w:rPr>
+        <w:t>Drivers</w:t>
+      </w:r>
+      <w:r>
+        <w:t>: Driver licenses, badge credentials, linked vehicles, and contact numbers.</w:t>
+      </w:r>
+    </w:p>
+    <w:p>
+      <w:pPr>
+        <w:pStyle w:val="ListBullet"/>
+        <w:spacing w:before="20" w:after="40"/>
+      </w:pPr>
+      <w:r/>
+      <w:r>
+        <w:rPr>
+          <w:b/>
+        </w:rPr>
+        <w:t>Clients &amp; Vendors</w:t>
+      </w:r>
+      <w:r>
+        <w:t>: Consignee corporate entities (Metro Cash &amp; Carry, Reliance Retail), GSTINs, and billing terms.</w:t>
+      </w:r>
+    </w:p>
+    <w:p>
+      <w:pPr>
+        <w:pStyle w:val="ListBullet"/>
+        <w:spacing w:before="20" w:after="40"/>
+      </w:pPr>
+      <w:r/>
+      <w:r>
+        <w:rPr>
+          <w:b/>
+        </w:rPr>
+        <w:t>Rate Cards</w:t>
+      </w:r>
+      <w:r>
+        <w:t>: Base freight rates per corridor, fuel surcharges, detention/demurrage hourly penalties, and toll reimbursement policies.</w:t>
+      </w:r>
+    </w:p>
+    <w:p>
+      <w:pPr>
+        <w:spacing w:before="120" w:after="120"/>
+      </w:pPr>
+      <w:r>
+        <w:rPr>
+          <w:color w:val="CBD5E1"/>
+          <w:sz w:val="16"/>
+        </w:rPr>
+        <w:t>_______________________________________________________________________________</w:t>
+      </w:r>
+    </w:p>
+    <w:p>
+      <w:pPr>
+        <w:pStyle w:val="Heading1"/>
+        <w:spacing w:before="280" w:after="80"/>
+      </w:pPr>
+      <w:r>
+        <w:rPr>
+          <w:rFonts w:ascii="Calibri" w:hAnsi="Calibri"/>
+          <w:b/>
+          <w:color w:val="1E3A8A"/>
+          <w:sz w:val="32"/>
+        </w:rPr>
+        <w:t>Summary of Frontend Technologies &amp; Standards</w:t>
       </w:r>
     </w:p>
     <w:tbl>
       <w:tblPr>
         <w:tblW w:type="auto" w:w="0"/>
         <w:jc w:val="center"/>
+        <w:tblLayout w:type="fixed"/>
         <w:tblLook w:firstColumn="1" w:firstRow="1" w:lastColumn="0" w:lastRow="0" w:noHBand="0" w:noVBand="1" w:val="04A0"/>
       </w:tblPr>
       <w:tblGrid>
-        <w:gridCol w:w="3120"/>
-        <w:gridCol w:w="3120"/>
-        <w:gridCol w:w="3120"/>
+        <w:gridCol w:w="3264"/>
+        <w:gridCol w:w="3264"/>
+        <w:gridCol w:w="3264"/>
       </w:tblGrid>
       <w:tr>
         <w:tc>
           <w:tcPr>
-            <w:tcW w:type="dxa" w:w="3120"/>
-            <w:shd w:fill="0F172A"/>
+            <w:tcW w:type="dxa" w:w="3264"/>
+            <w:tcMar>
+              <w:top w:w="120" w:type="dxa"/>
+              <w:bottom w:w="120" w:type="dxa"/>
+              <w:left w:w="160" w:type="dxa"/>
+              <w:right w:w="160" w:type="dxa"/>
+            </w:tcMar>
+            <w:shd w:fill="1E293B"/>
           </w:tcPr>
           <w:p>
+            <w:pPr>
+              <w:spacing w:before="40" w:after="40"/>
+            </w:pPr>
             <w:r>
               <w:rPr>
                 <w:b/>
                 <w:color w:val="FFFFFF"/>
+                <w:sz w:val="19"/>
               </w:rPr>
-              <w:t>Role / Portal</w:t>
+              <w:t>Layer</w:t>
             </w:r>
           </w:p>
         </w:tc>
         <w:tc>
           <w:tcPr>
-            <w:tcW w:type="dxa" w:w="3120"/>
-            <w:shd w:fill="0F172A"/>
+            <w:tcW w:type="dxa" w:w="3264"/>
+            <w:tcMar>
+              <w:top w:w="120" w:type="dxa"/>
+              <w:bottom w:w="120" w:type="dxa"/>
+              <w:left w:w="160" w:type="dxa"/>
+              <w:right w:w="160" w:type="dxa"/>
+            </w:tcMar>
+            <w:shd w:fill="1E293B"/>
           </w:tcPr>
           <w:p>
+            <w:pPr>
+              <w:spacing w:before="40" w:after="40"/>
+            </w:pPr>
             <w:r>
               <w:rPr>
                 <w:b/>
                 <w:color w:val="FFFFFF"/>
+                <w:sz w:val="19"/>
               </w:rPr>
-              <w:t>Route Path</w:t>
+              <w:t>Technology</w:t>
             </w:r>
           </w:p>
         </w:tc>
         <w:tc>
           <w:tcPr>
-            <w:tcW w:type="dxa" w:w="3120"/>
-            <w:shd w:fill="0F172A"/>
+            <w:tcW w:type="dxa" w:w="3264"/>
+            <w:tcMar>
+              <w:top w:w="120" w:type="dxa"/>
+              <w:bottom w:w="120" w:type="dxa"/>
+              <w:left w:w="160" w:type="dxa"/>
+              <w:right w:w="160" w:type="dxa"/>
+            </w:tcMar>
+            <w:shd w:fill="1E293B"/>
           </w:tcPr>
           <w:p>
+            <w:pPr>
+              <w:spacing w:before="40" w:after="40"/>
+            </w:pPr>
             <w:r>
               <w:rPr>
                 <w:b/>
                 <w:color w:val="FFFFFF"/>
+                <w:sz w:val="19"/>
               </w:rPr>
-              <w:t>Primary Operational Focus</w:t>
+              <w:t>Usage</w:t>
             </w:r>
           </w:p>
         </w:tc>
@@ -113,38 +3415,73 @@
       <w:tr>
         <w:tc>
           <w:tcPr>
-            <w:tcW w:type="dxa" w:w="3120"/>
+            <w:tcW w:type="dxa" w:w="3264"/>
+            <w:tcMar>
+              <w:top w:w="120" w:type="dxa"/>
+              <w:bottom w:w="120" w:type="dxa"/>
+              <w:left w:w="160" w:type="dxa"/>
+              <w:right w:w="160" w:type="dxa"/>
+            </w:tcMar>
+            <w:shd w:fill="F8FAFC"/>
           </w:tcPr>
           <w:p>
+            <w:pPr>
+              <w:spacing w:before="40" w:after="40"/>
+            </w:pPr>
             <w:r>
               <w:rPr>
-                <w:b/>
+                <w:color w:val="334155"/>
+                <w:sz w:val="19"/>
               </w:rPr>
-              <w:t>1. Dispatch Ops Dashboard</w:t>
+              <w:t>**Framework**</w:t>
             </w:r>
           </w:p>
         </w:tc>
         <w:tc>
           <w:tcPr>
-            <w:tcW w:type="dxa" w:w="3120"/>
+            <w:tcW w:type="dxa" w:w="3264"/>
+            <w:tcMar>
+              <w:top w:w="120" w:type="dxa"/>
+              <w:bottom w:w="120" w:type="dxa"/>
+              <w:left w:w="160" w:type="dxa"/>
+              <w:right w:w="160" w:type="dxa"/>
+            </w:tcMar>
+            <w:shd w:fill="F8FAFC"/>
           </w:tcPr>
           <w:p>
+            <w:pPr>
+              <w:spacing w:before="40" w:after="40"/>
+            </w:pPr>
             <w:r>
               <w:rPr>
-                <w:rFonts w:ascii="Courier New" w:hAnsi="Courier New"/>
+                <w:color w:val="334155"/>
                 <w:sz w:val="19"/>
               </w:rPr>
-              <w:t>/</w:t>
+              <w:t>Next.js 14 (App Router)</w:t>
             </w:r>
           </w:p>
         </w:tc>
         <w:tc>
           <w:tcPr>
-            <w:tcW w:type="dxa" w:w="3120"/>
+            <w:tcW w:type="dxa" w:w="3264"/>
+            <w:tcMar>
+              <w:top w:w="120" w:type="dxa"/>
+              <w:bottom w:w="120" w:type="dxa"/>
+              <w:left w:w="160" w:type="dxa"/>
+              <w:right w:w="160" w:type="dxa"/>
+            </w:tcMar>
+            <w:shd w:fill="F8FAFC"/>
           </w:tcPr>
           <w:p>
+            <w:pPr>
+              <w:spacing w:before="40" w:after="40"/>
+            </w:pPr>
             <w:r>
-              <w:t>Live fleet telematics grid, driver float advance, and EOD tally closures.</w:t>
+              <w:rPr>
+                <w:color w:val="334155"/>
+                <w:sz w:val="19"/>
+              </w:rPr>
+              <w:t>File-based routing (`/login`, `/invite/accept`, `/dispatch`, `/driver`, `/audit`, `/accounts`, `/client-portal`, `/admin`)</w:t>
             </w:r>
           </w:p>
         </w:tc>
@@ -152,41 +3489,73 @@
       <w:tr>
         <w:tc>
           <w:tcPr>
-            <w:tcW w:type="dxa" w:w="3120"/>
-            <w:shd w:fill="F8FAFC"/>
+            <w:tcW w:type="dxa" w:w="3264"/>
+            <w:tcMar>
+              <w:top w:w="120" w:type="dxa"/>
+              <w:bottom w:w="120" w:type="dxa"/>
+              <w:left w:w="160" w:type="dxa"/>
+              <w:right w:w="160" w:type="dxa"/>
+            </w:tcMar>
+            <w:shd w:fill="FFFFFF"/>
           </w:tcPr>
           <w:p>
+            <w:pPr>
+              <w:spacing w:before="40" w:after="40"/>
+            </w:pPr>
             <w:r>
               <w:rPr>
-                <w:b/>
+                <w:color w:val="334155"/>
+                <w:sz w:val="19"/>
               </w:rPr>
-              <w:t>2. Driver Mobile-Web App</w:t>
+              <w:t>**Edge Security**</w:t>
             </w:r>
           </w:p>
         </w:tc>
         <w:tc>
           <w:tcPr>
-            <w:tcW w:type="dxa" w:w="3120"/>
-            <w:shd w:fill="F8FAFC"/>
+            <w:tcW w:type="dxa" w:w="3264"/>
+            <w:tcMar>
+              <w:top w:w="120" w:type="dxa"/>
+              <w:bottom w:w="120" w:type="dxa"/>
+              <w:left w:w="160" w:type="dxa"/>
+              <w:right w:w="160" w:type="dxa"/>
+            </w:tcMar>
+            <w:shd w:fill="FFFFFF"/>
           </w:tcPr>
           <w:p>
+            <w:pPr>
+              <w:spacing w:before="40" w:after="40"/>
+            </w:pPr>
             <w:r>
               <w:rPr>
-                <w:rFonts w:ascii="Courier New" w:hAnsi="Courier New"/>
+                <w:color w:val="334155"/>
                 <w:sz w:val="19"/>
               </w:rPr>
-              <w:t>/driver</w:t>
+              <w:t>Next.js Middleware (`middleware.ts`)</w:t>
             </w:r>
           </w:p>
         </w:tc>
         <w:tc>
           <w:tcPr>
-            <w:tcW w:type="dxa" w:w="3120"/>
-            <w:shd w:fill="F8FAFC"/>
+            <w:tcW w:type="dxa" w:w="3264"/>
+            <w:tcMar>
+              <w:top w:w="120" w:type="dxa"/>
+              <w:bottom w:w="120" w:type="dxa"/>
+              <w:left w:w="160" w:type="dxa"/>
+              <w:right w:w="160" w:type="dxa"/>
+            </w:tcMar>
+            <w:shd w:fill="FFFFFF"/>
           </w:tcPr>
           <w:p>
+            <w:pPr>
+              <w:spacing w:before="40" w:after="40"/>
+            </w:pPr>
             <w:r>
-              <w:t>Outdoor-glare HUD, turn-by-turn guidance, LR camera capture, and glass signing.</w:t>
+              <w:rPr>
+                <w:color w:val="334155"/>
+                <w:sz w:val="19"/>
+              </w:rPr>
+              <w:t>Edge runtime cookie verification and zero-latency route redirection</w:t>
             </w:r>
           </w:p>
         </w:tc>
@@ -194,38 +3563,73 @@
       <w:tr>
         <w:tc>
           <w:tcPr>
-            <w:tcW w:type="dxa" w:w="3120"/>
+            <w:tcW w:type="dxa" w:w="3264"/>
+            <w:tcMar>
+              <w:top w:w="120" w:type="dxa"/>
+              <w:bottom w:w="120" w:type="dxa"/>
+              <w:left w:w="160" w:type="dxa"/>
+              <w:right w:w="160" w:type="dxa"/>
+            </w:tcMar>
+            <w:shd w:fill="F8FAFC"/>
           </w:tcPr>
           <w:p>
+            <w:pPr>
+              <w:spacing w:before="40" w:after="40"/>
+            </w:pPr>
             <w:r>
               <w:rPr>
-                <w:b/>
+                <w:color w:val="334155"/>
+                <w:sz w:val="19"/>
               </w:rPr>
-              <w:t>3. Internal Audit Workspace</w:t>
+              <w:t>**Styling**</w:t>
             </w:r>
           </w:p>
         </w:tc>
         <w:tc>
           <w:tcPr>
-            <w:tcW w:type="dxa" w:w="3120"/>
+            <w:tcW w:type="dxa" w:w="3264"/>
+            <w:tcMar>
+              <w:top w:w="120" w:type="dxa"/>
+              <w:bottom w:w="120" w:type="dxa"/>
+              <w:left w:w="160" w:type="dxa"/>
+              <w:right w:w="160" w:type="dxa"/>
+            </w:tcMar>
+            <w:shd w:fill="F8FAFC"/>
           </w:tcPr>
           <w:p>
+            <w:pPr>
+              <w:spacing w:before="40" w:after="40"/>
+            </w:pPr>
             <w:r>
               <w:rPr>
-                <w:rFonts w:ascii="Courier New" w:hAnsi="Courier New"/>
+                <w:color w:val="334155"/>
                 <w:sz w:val="19"/>
               </w:rPr>
-              <w:t>/audit</w:t>
+              <w:t>Tailwind CSS</w:t>
             </w:r>
           </w:p>
         </w:tc>
         <w:tc>
           <w:tcPr>
-            <w:tcW w:type="dxa" w:w="3120"/>
+            <w:tcW w:type="dxa" w:w="3264"/>
+            <w:tcMar>
+              <w:top w:w="120" w:type="dxa"/>
+              <w:bottom w:w="120" w:type="dxa"/>
+              <w:left w:w="160" w:type="dxa"/>
+              <w:right w:w="160" w:type="dxa"/>
+            </w:tcMar>
+            <w:shd w:fill="F8FAFC"/>
           </w:tcPr>
           <w:p>
+            <w:pPr>
+              <w:spacing w:before="40" w:after="40"/>
+            </w:pPr>
             <w:r>
-              <w:t>50/50 split-pane viewer (zoom/rotate), GPS vs odometer match, 5-gate checklist.</w:t>
+              <w:rPr>
+                <w:color w:val="334155"/>
+                <w:sz w:val="19"/>
+              </w:rPr>
+              <w:t>Utility-first, enterprise high-density layouts, border systems, responsive breakpoints</w:t>
             </w:r>
           </w:p>
         </w:tc>
@@ -233,41 +3637,73 @@
       <w:tr>
         <w:tc>
           <w:tcPr>
-            <w:tcW w:type="dxa" w:w="3120"/>
-            <w:shd w:fill="F8FAFC"/>
+            <w:tcW w:type="dxa" w:w="3264"/>
+            <w:tcMar>
+              <w:top w:w="120" w:type="dxa"/>
+              <w:bottom w:w="120" w:type="dxa"/>
+              <w:left w:w="160" w:type="dxa"/>
+              <w:right w:w="160" w:type="dxa"/>
+            </w:tcMar>
+            <w:shd w:fill="FFFFFF"/>
           </w:tcPr>
           <w:p>
+            <w:pPr>
+              <w:spacing w:before="40" w:after="40"/>
+            </w:pPr>
             <w:r>
               <w:rPr>
-                <w:b/>
+                <w:color w:val="334155"/>
+                <w:sz w:val="19"/>
               </w:rPr>
-              <w:t>4. Logistics Accounts &amp; Billing</w:t>
+              <w:t>**Component Primitives**</w:t>
             </w:r>
           </w:p>
         </w:tc>
         <w:tc>
           <w:tcPr>
-            <w:tcW w:type="dxa" w:w="3120"/>
-            <w:shd w:fill="F8FAFC"/>
+            <w:tcW w:type="dxa" w:w="3264"/>
+            <w:tcMar>
+              <w:top w:w="120" w:type="dxa"/>
+              <w:bottom w:w="120" w:type="dxa"/>
+              <w:left w:w="160" w:type="dxa"/>
+              <w:right w:w="160" w:type="dxa"/>
+            </w:tcMar>
+            <w:shd w:fill="FFFFFF"/>
           </w:tcPr>
           <w:p>
+            <w:pPr>
+              <w:spacing w:before="40" w:after="40"/>
+            </w:pPr>
             <w:r>
               <w:rPr>
-                <w:rFonts w:ascii="Courier New" w:hAnsi="Courier New"/>
+                <w:color w:val="334155"/>
                 <w:sz w:val="19"/>
               </w:rPr>
-              <w:t>/accounts</w:t>
+              <w:t>shadcn/ui (Radix UI)</w:t>
             </w:r>
           </w:p>
         </w:tc>
         <w:tc>
           <w:tcPr>
-            <w:tcW w:type="dxa" w:w="3120"/>
-            <w:shd w:fill="F8FAFC"/>
+            <w:tcW w:type="dxa" w:w="3264"/>
+            <w:tcMar>
+              <w:top w:w="120" w:type="dxa"/>
+              <w:bottom w:w="120" w:type="dxa"/>
+              <w:left w:w="160" w:type="dxa"/>
+              <w:right w:w="160" w:type="dxa"/>
+            </w:tcMar>
+            <w:shd w:fill="FFFFFF"/>
           </w:tcPr>
           <w:p>
+            <w:pPr>
+              <w:spacing w:before="40" w:after="40"/>
+            </w:pPr>
             <w:r>
-              <w:t>Unbilled trip pooling, 18% GST calculation (SAC 996511), and formal tax invoice generator.</w:t>
+              <w:rPr>
+                <w:color w:val="334155"/>
+                <w:sz w:val="19"/>
+              </w:rPr>
+              <w:t>Accessible Dialog, Table, Card, Badge, Checkbox, Tabs, Textarea, Separator, Switch</w:t>
             </w:r>
           </w:p>
         </w:tc>
@@ -275,515 +3711,73 @@
       <w:tr>
         <w:tc>
           <w:tcPr>
-            <w:tcW w:type="dxa" w:w="3120"/>
+            <w:tcW w:type="dxa" w:w="3264"/>
+            <w:tcMar>
+              <w:top w:w="120" w:type="dxa"/>
+              <w:bottom w:w="120" w:type="dxa"/>
+              <w:left w:w="160" w:type="dxa"/>
+              <w:right w:w="160" w:type="dxa"/>
+            </w:tcMar>
+            <w:shd w:fill="F8FAFC"/>
           </w:tcPr>
           <w:p>
+            <w:pPr>
+              <w:spacing w:before="40" w:after="40"/>
+            </w:pPr>
             <w:r>
               <w:rPr>
-                <w:b/>
+                <w:color w:val="334155"/>
+                <w:sz w:val="19"/>
               </w:rPr>
-              <w:t>5. Client AP Portal</w:t>
+              <w:t>**Iconography**</w:t>
             </w:r>
           </w:p>
         </w:tc>
         <w:tc>
           <w:tcPr>
-            <w:tcW w:type="dxa" w:w="3120"/>
+            <w:tcW w:type="dxa" w:w="3264"/>
+            <w:tcMar>
+              <w:top w:w="120" w:type="dxa"/>
+              <w:bottom w:w="120" w:type="dxa"/>
+              <w:left w:w="160" w:type="dxa"/>
+              <w:right w:w="160" w:type="dxa"/>
+            </w:tcMar>
+            <w:shd w:fill="F8FAFC"/>
           </w:tcPr>
           <w:p>
+            <w:pPr>
+              <w:spacing w:before="40" w:after="40"/>
+            </w:pPr>
             <w:r>
               <w:rPr>
-                <w:rFonts w:ascii="Courier New" w:hAnsi="Courier New"/>
+                <w:color w:val="334155"/>
                 <w:sz w:val="19"/>
               </w:rPr>
-              <w:t>/client-portal</w:t>
+              <w:t>`lucide-react`</w:t>
             </w:r>
           </w:p>
         </w:tc>
         <w:tc>
           <w:tcPr>
-            <w:tcW w:type="dxa" w:w="3120"/>
+            <w:tcW w:type="dxa" w:w="3264"/>
+            <w:tcMar>
+              <w:top w:w="120" w:type="dxa"/>
+              <w:bottom w:w="120" w:type="dxa"/>
+              <w:left w:w="160" w:type="dxa"/>
+              <w:right w:w="160" w:type="dxa"/>
+            </w:tcMar>
+            <w:shd w:fill="F8FAFC"/>
           </w:tcPr>
           <w:p>
-            <w:r>
-              <w:t>Consignee invoice review, digital POD inspection, and inline line dispute drawer.</w:t>
-            </w:r>
-          </w:p>
-        </w:tc>
-      </w:tr>
-    </w:tbl>
-    <w:p>
-      <w:pPr>
-        <w:spacing w:after="320"/>
-      </w:pPr>
-    </w:p>
-    <w:p>
-      <w:pPr>
-        <w:pStyle w:val="Heading1"/>
-      </w:pPr>
-      <w:r>
-        <w:t>2. Role 1: Dispatch Manager Dashboard</w:t>
-      </w:r>
-    </w:p>
-    <w:p>
-      <w:pPr>
-        <w:pStyle w:val="Heading2"/>
-      </w:pPr>
-      <w:r>
-        <w:t>2.1 Core Objective</w:t>
-      </w:r>
-    </w:p>
-    <w:p>
-      <w:r>
-        <w:t>Grants regional dispatch superintendents real-time situational awareness over active fleet deployments, vehicle telematics, driver cash floats, and End-of-Day (EOD) financial closures at logistics terminals.</w:t>
-      </w:r>
-    </w:p>
-    <w:p>
-      <w:pPr>
-        <w:pStyle w:val="Heading2"/>
-      </w:pPr>
-      <w:r>
-        <w:t>2.2 Architectural &amp; UI/UX Design Rationale</w:t>
-      </w:r>
-    </w:p>
-    <w:p>
-      <w:r>
-        <w:t>• High-Density Enterprise SaaS (Retool/Linear Style): Dispatchers manage hundreds of trips daily. Screen efficiency is maximized with py-2.5 cell height, h-8 inputs/buttons, and text-xs typography to prevent unnecessary vertical scrolling.</w:t>
-        <w:br/>
-        <w:t>• Muted Monochromatic Palette: Built on clean bg-white cards with bg-slate-50 backdrop, border-slate-200, and text-slate-800 text. High-saturation colors are strictly reserved for operational exceptions (e.g. amber for Delayed trips, red for cash deficits).</w:t>
-        <w:br/>
-        <w:t>• Tabular Monospace Alignment: Vehicle registration numbers (MH 12 RN 4920), odometers (142,380 km), and currency figures utilize monospace font variants (font-mono) to guarantee vertical decimal alignment for rapid visual auditing.</w:t>
-      </w:r>
-    </w:p>
-    <w:p>
-      <w:pPr>
-        <w:pStyle w:val="Heading2"/>
-      </w:pPr>
-      <w:r>
-        <w:t>2.3 Key Features &amp; Components</w:t>
-      </w:r>
-    </w:p>
-    <w:p>
-      <w:r>
-        <w:t>• Collapsible Operational Left Sidebar: Fixed-width navigation with brand identity (VECTO LOGISTICS), active shift profile, and system health indicator (ISO-28000 / POD-2PL Synced).</w:t>
-        <w:br/>
-        <w:t>• Top Operational Header: Search input with real-time substring filtering across Vehicle Reg No, Driver Name, Destination, and Trip ID; simulated shift/date picker; and live fleet metric pill (Active | Delayed | Total Fleet).</w:t>
-        <w:br/>
-        <w:t>• Executive KPI Strip: 4 compact summary cards tracking Live Dispatched, Expected COD Inbound (₹), Dispatched Advances (₹), and Pending EOD Audit.</w:t>
-        <w:br/>
-        <w:t>• Live Vehicle &amp; Trip Grid (Table, Card): Displays Vehicle Reg No, Driver Contact, Destination Corridor, Start/Current Odometer, Trip Status badge, and per-row action buttons ('Log Expense' and 'Close Trip').</w:t>
-        <w:br/>
-        <w:t>• EOD Cash &amp; Expense Modal (Dialog): Form input fields for FASTag tolls, driver daily allowance (bhatta), emergency fuel slips, and total COD collected with live mathematical reconciliation.</w:t>
-      </w:r>
-    </w:p>
-    <w:p>
-      <w:pPr>
-        <w:pStyle w:val="Heading2"/>
-      </w:pPr>
-      <w:r>
-        <w:t>2.4 State &amp; Data Flow (Frontend Logic)</w:t>
-      </w:r>
-    </w:p>
-    <w:p>
-      <w:r>
-        <w:t>• Real-time Filter &amp; Search State: Driven by searchQuery and selectedStatusFilter hooks feeding a memoized useMemo pipeline that filters INITIAL_FLEET_DATA without server round-trips.</w:t>
-        <w:br/>
-        <w:t>• EOD Tally Mathematical Model: Total Expenses (E) = Toll + Allowance + Fuel. Unspent Advance = Advance - E. Net Expected Remittance = COD + Unspent Advance. Discrepancy (Δ) = Actual Cash Collected - Expected Remittance.</w:t>
-        <w:br/>
-        <w:t>• Discrepancy Visual Feedback: A dynamic conditional container highlights Balanced (Zero Discrepancy) in emerald, Surplus Cash in blue, or Deficit / Shortage Action Required in red.</w:t>
-      </w:r>
-    </w:p>
-    <w:p>
-      <w:pPr>
-        <w:spacing w:after="240"/>
-      </w:pPr>
-    </w:p>
-    <w:p>
-      <w:pPr>
-        <w:pStyle w:val="Heading1"/>
-      </w:pPr>
-      <w:r>
-        <w:t>3. Role 2: Driver Mobile-Web App</w:t>
-      </w:r>
-    </w:p>
-    <w:p>
-      <w:pPr>
-        <w:pStyle w:val="Heading2"/>
-      </w:pPr>
-      <w:r>
-        <w:t>3.1 Core Objective</w:t>
-      </w:r>
-    </w:p>
-    <w:p>
-      <w:r>
-        <w:t>Provides truck drivers with an outdoor-glare-resistant, touch-optimized mobile interface to navigate delivery stops, capture physical Lorry Receipts (LR), record receiver digital signatures, and collect COD remittances.</w:t>
-      </w:r>
-    </w:p>
-    <w:p>
-      <w:pPr>
-        <w:pStyle w:val="Heading2"/>
-      </w:pPr>
-      <w:r>
-        <w:t>3.2 Architectural &amp; UI/UX Design Rationale</w:t>
-      </w:r>
-    </w:p>
-    <w:p>
-      <w:r>
-        <w:t>• Centered Mobile-First Shell: Wrapped in a constrained viewport container (max-w-md mx-auto min-h-screen border-x border-slate-300 pb-24) simulating native iOS/Android handheld operating behavior.</w:t>
-        <w:br/>
-        <w:t>• Outdoor Glare &amp; Glove Optimization: High-contrast dark status headers, bold high-contrast text (text-slate-900, font-black), stark 2px solid borders, and massive action buttons (py-7, text-lg) with high-visibility corporate blue (bg-blue-700) and emerald green (bg-emerald-600).</w:t>
-        <w:br/>
-        <w:t>• Tactile Hierarchy: Prevents accidental taps while driving by requiring deliberate thumb gestures on prominent touch zones.</w:t>
-      </w:r>
-    </w:p>
-    <w:p>
-      <w:pPr>
-        <w:pStyle w:val="Heading2"/>
-      </w:pPr>
-      <w:r>
-        <w:t>3.3 Key Features &amp; Components</w:t>
-      </w:r>
-    </w:p>
-    <w:p>
-      <w:r>
-        <w:t>• Rugged Device Status Header: Duty toggle button ('Start Shift' / 'End Shift'), live 4G LTE and battery indicators, vehicle registration badge, and quick link to Dispatch UI.</w:t>
-        <w:br/>
-        <w:t>• Current Active Delivery Card: Displays primary destination (Metro Cash &amp; Carry - Whitefield DC), client name, cargo specifications (12 Pallets FMCG, 3.8 Tonnes, ₹24,500 COD), and direct one-tap telephone dialer to the consignee gate manager.</w:t>
-        <w:br/>
-        <w:t>• Simulated GPS Routing HUD: Dark-mode GPS display showing speed (48 km/h), distance remaining (45 km), ETA countdown (52 mins), route corridor (NH-48 via Outer Ring Road), and turn-by-turn guidance.</w:t>
-        <w:br/>
-        <w:t>• Up Next Stop Queue: Preview cards for subsequent stops in the route (Stop #2: Reliance Retail, Stop #3: Flipkart Wholesale).</w:t>
-        <w:br/>
-        <w:t>• Digital POD &amp; Payment Collection Modal (Dialog): Full-screen modal housing LR Camera Dropzone, HTML5 Canvas 'Sign on Glass' signature pad, and high-contrast Cash vs UPI QR payment toggle.</w:t>
-      </w:r>
-    </w:p>
-    <w:p>
-      <w:pPr>
-        <w:pStyle w:val="Heading2"/>
-      </w:pPr>
-      <w:r>
-        <w:t>3.4 State &amp; Data Flow (Frontend Logic)</w:t>
-      </w:r>
-    </w:p>
-    <w:p>
-      <w:r>
-        <w:t>• Trip Stage Machine: Transitions between 'driving' → 'arrived' → 'completed'. Tapping 'Reached Destination' advances status to 'Complete Delivery &amp; POD', unlocking the submission modal.</w:t>
-        <w:br/>
-        <w:t>• Canvas Touch Drawing State: Managed via HTML5 2D Canvas context (canvasRef). Captures both touch events (mobile devices) and mouse strokes (desktop testing), tracking signature strokes.</w:t>
-        <w:br/>
-        <w:t>• Validation Gating: Validates that hasCapturedPhoto is true before committing; upon confirmation, a success alert confirms settlement.</w:t>
-      </w:r>
-    </w:p>
-    <w:p>
-      <w:pPr>
-        <w:spacing w:after="240"/>
-      </w:pPr>
-    </w:p>
-    <w:p>
-      <w:pPr>
-        <w:pStyle w:val="Heading1"/>
-      </w:pPr>
-      <w:r>
-        <w:t>4. Role 3: Internal Audit Workspace</w:t>
-      </w:r>
-    </w:p>
-    <w:p>
-      <w:pPr>
-        <w:pStyle w:val="Heading2"/>
-      </w:pPr>
-      <w:r>
-        <w:t>4.1 Core Objective</w:t>
-      </w:r>
-    </w:p>
-    <w:p>
-      <w:r>
-        <w:t>Enables secondary-level freight auditors to cross-verify physical delivery documents against telematics data, inspect consignee stamps and signatures, detect freight/toll variances, and either certify invoices for billing or log disputes.</w:t>
-      </w:r>
-    </w:p>
-    <w:p>
-      <w:pPr>
-        <w:pStyle w:val="Heading2"/>
-      </w:pPr>
-      <w:r>
-        <w:t>4.2 Architectural &amp; UI/UX Design Rationale</w:t>
-      </w:r>
-    </w:p>
-    <w:p>
-      <w:r>
-        <w:t>• 50/50 Split-Pane Layout: Eliminates tab-switching cognitive load by placing the physical document on the Left Pane and the digital system data on the Right Pane side-by-side.</w:t>
-        <w:br/>
-        <w:t>• High-Density Verification Workspace: Clean white cards, muted slate accents, and monospace financial/mileage comparisons designed for rapid verification throughput (&lt; 2 minutes per consignment).</w:t>
-      </w:r>
-    </w:p>
-    <w:p>
-      <w:pPr>
-        <w:pStyle w:val="Heading2"/>
-      </w:pPr>
-      <w:r>
-        <w:t>4.3 Key Features &amp; Components</w:t>
-      </w:r>
-    </w:p>
-    <w:p>
-      <w:r>
-        <w:t>• Interactive Document Viewer (Left Pane): Zoom In (+25%), Zoom Out (-25%), Rotate 90° clockwise, and 1-click Reset.</w:t>
-        <w:br/>
-        <w:t>• Digital LR Consignment Note Canvas: Renders high-fidelity consignment metadata, gate inward timestamp, and physical warehouse stamp.</w:t>
-        <w:br/>
-        <w:t>• Sign-on-Glass Digital Verification Sub-Panel: Displays cryptographic auth hash (#a98f-44e2-9b01), signatory credentials, and dock GPS tag.</w:t>
-        <w:br/>
-        <w:t>• Audit Telematics &amp; Financial Pane (Right Pane): Trip metadata, departure/arrival timestamps, and GPS vs Odometer distance variance calculator.</w:t>
-        <w:br/>
-        <w:t>• Financial Tally Table: Line-item variance matrix comparing Driver Reported vs System Policy for Tolls, Fuel, Allowance, and COD.</w:t>
-        <w:br/>
-        <w:t>• Interactive 5-Gate Checklist: Distance Match, Cash Match, Signature Present, Consignee Stamp Verified, and Document Legibility.</w:t>
-        <w:br/>
-        <w:t>• Sticky Action Footer: 'Raise Discrepancy' (Red Outline) to freeze billing or 'Verify &amp; Send to Billing' (Dark Solid) to approve.</w:t>
-      </w:r>
-    </w:p>
-    <w:p>
-      <w:pPr>
-        <w:pStyle w:val="Heading2"/>
-      </w:pPr>
-      <w:r>
-        <w:t>4.4 State &amp; Data Flow (Frontend Logic)</w:t>
-      </w:r>
-    </w:p>
-    <w:p>
-      <w:r>
-        <w:t>• Transform Matrix Manipulation: zoomLevel and rotation states directly manipulate CSS transform: scale(...) rotate(...) with hardware acceleration.</w:t>
-        <w:br/>
-        <w:t>• Multi-Trip Queue Switching: selectedTripId drives reactive memoization to swap active documents, telematics, and financial tables on demand.</w:t>
-        <w:br/>
-        <w:t>• Checklist State Engine: An object state dictionary toggles boolean checklist gates, updating row alert colors.</w:t>
-      </w:r>
-    </w:p>
-    <w:p>
-      <w:pPr>
-        <w:spacing w:after="240"/>
-      </w:pPr>
-    </w:p>
-    <w:p>
-      <w:pPr>
-        <w:pStyle w:val="Heading1"/>
-      </w:pPr>
-      <w:r>
-        <w:t>5. Role 4: Logistics Accounts &amp; Billing</w:t>
-      </w:r>
-    </w:p>
-    <w:p>
-      <w:pPr>
-        <w:pStyle w:val="Heading2"/>
-      </w:pPr>
-      <w:r>
-        <w:t>5.1 Core Objective</w:t>
-      </w:r>
-    </w:p>
-    <w:p>
-      <w:r>
-        <w:t>Allows the 3PL finance and billing team to pool audit-cleared trips, compute accessorial charges (toll, demurrage), calculate statutory Indian GST taxes (18% under SAC 996511), and generate consolidated tax invoices.</w:t>
-      </w:r>
-    </w:p>
-    <w:p>
-      <w:pPr>
-        <w:pStyle w:val="Heading2"/>
-      </w:pPr>
-      <w:r>
-        <w:t>5.2 Architectural &amp; UI/UX Design Rationale</w:t>
-      </w:r>
-    </w:p>
-    <w:p>
-      <w:r>
-        <w:t>• Tabular ERP Data Density: Built for accounting clerks handling multi-trip consignment statements. Monospaced numeric alignment guarantees readability across high-value invoices.</w:t>
-        <w:br/>
-        <w:t>• Dual-Tab Perspective: Distinguishes between unbilled inventory (Pending Billing) and committed receivables (Accounts Receivable Ledger).</w:t>
-      </w:r>
-    </w:p>
-    <w:p>
-      <w:pPr>
-        <w:pStyle w:val="Heading2"/>
-      </w:pPr>
-      <w:r>
-        <w:t>5.3 Key Features &amp; Components</w:t>
-      </w:r>
-    </w:p>
-    <w:p>
-      <w:r>
-        <w:t>• Executive Accounts Header: Search bar across Client, Invoice, and Trip ID, paired with financial KPIs (Outstanding AR, Overdue, Ready to Bill).</w:t>
-        <w:br/>
-        <w:t>• Tab 1: Pending Billing (Unbilled Trips Queue): Multi-select checkboxes with global 'Select All' header toggle, base freight, and accessorials.</w:t>
-        <w:br/>
-        <w:t>• Floating Sticky Bottom Action Bar: Slides up when rows are selected, showing live counts: X Trips Selected | Subtotal: ₹Y | Est. GST (18%): ₹Z | Grand Total: ₹W.</w:t>
-        <w:br/>
-        <w:t>• Tab 2: Accounts Receivable Ledger: Tracks published invoices, issuance/due dates, trip counts, subtotal, 18% GST, grand total, and payment status badges.</w:t>
-        <w:br/>
-        <w:t>• Widget: Formal GST Tax Invoice Draft Generator (Dialog): Complies with Indian Rule 46 GST Tax Invoice specifications with seller and client bill-to details, SAC 996511 breakdown, bank remittance details (ICICI Bank A/C, IFSC, UPI VPA), and publishing trigger.</w:t>
-      </w:r>
-    </w:p>
-    <w:p>
-      <w:pPr>
-        <w:pStyle w:val="Heading2"/>
-      </w:pPr>
-      <w:r>
-        <w:t>5.4 State &amp; Data Flow (Frontend Logic)</w:t>
-      </w:r>
-    </w:p>
-    <w:p>
-      <w:r>
-        <w:t>• Multi-Selection Array State: Managed via selectedTripIds: string[]. Toggling checkboxes dynamically recalculates subtotal, 18% GST, and grand total.</w:t>
-        <w:br/>
-        <w:t>• Dynamic GST Tax Math: Subtotal (S) = Sum(Freight + Toll + Demurrage). GST (18%) = round(S * 0.18). Grand Total = S + GST.</w:t>
-        <w:br/>
-        <w:t>• Publishing Pipeline: Submitting the draft generates an invoice ID (VEC-INV-2026-XXXX), clears selection arrays, and posts confirmation.</w:t>
-      </w:r>
-    </w:p>
-    <w:p>
-      <w:pPr>
-        <w:spacing w:after="240"/>
-      </w:pPr>
-    </w:p>
-    <w:p>
-      <w:pPr>
-        <w:pStyle w:val="Heading1"/>
-      </w:pPr>
-      <w:r>
-        <w:t>6. Role 5: Client / Vendor Accounts Payable Portal</w:t>
-      </w:r>
-    </w:p>
-    <w:p>
-      <w:pPr>
-        <w:pStyle w:val="Heading2"/>
-      </w:pPr>
-      <w:r>
-        <w:t>6.1 Core Objective</w:t>
-      </w:r>
-    </w:p>
-    <w:p>
-      <w:r>
-        <w:t>An external, client-facing self-service portal for enterprise customers (e.g. Metro Cash &amp; Carry) to inspect inbound freight invoices, examine digital POD receipts, raise itemized line disputes, and approve settlements.</w:t>
-      </w:r>
-    </w:p>
-    <w:p>
-      <w:pPr>
-        <w:pStyle w:val="Heading2"/>
-      </w:pPr>
-      <w:r>
-        <w:t>6.2 Architectural &amp; UI/UX Design Rationale</w:t>
-      </w:r>
-    </w:p>
-    <w:p>
-      <w:r>
-        <w:t>• Differentiated Client Branding: Features a light-slate/white sidebar with client corporate insignia (Metro Cash &amp; Carry, Consignee ID AP-IND-01), establishing trust for an external portal.</w:t>
-        <w:br/>
-        <w:t>• Non-Destructive Inline Dispute Design: Rather than rejecting an entire invoice over a single damaged pallet, client managers can dispute specific line items while approving clean lines, preventing carrier cash flow disruption.</w:t>
-      </w:r>
-    </w:p>
-    <w:p>
-      <w:pPr>
-        <w:pStyle w:val="Heading2"/>
-      </w:pPr>
-      <w:r>
-        <w:t>6.3 Key Features &amp; Components</w:t>
-      </w:r>
-    </w:p>
-    <w:p>
-      <w:r>
-        <w:t>• Client AP Header: Welcome banner ('Welcome, Metro Finance Team'), vendor reference, and financial metrics pill.</w:t>
-        <w:br/>
-        <w:t>• Invoice Inbox Grid: Table displaying incoming freight invoices, issue dates, payment due dates, gross amounts, and status badges.</w:t>
-        <w:br/>
-        <w:t>• Invoice Deep-Dive Modal (Dialog): Wide modal displaying invoice header summary and an itemized breakdown of trips.</w:t>
-        <w:br/>
-        <w:t>• 'View POD' Action: Expands a verified delivery card showing the warehouse gate dock stamp and the receiver's glass digital signature.</w:t>
-        <w:br/>
-        <w:t>• Interactive Inline Dispute Drawer: Expands seamlessly beneath the target consignment row with dispute grounds dropdown, deduction amount input, and comments textarea.</w:t>
-        <w:br/>
-        <w:t>• Dynamic Approval Action Button: Switches between 'Approve Invoice for Payment' and 'Approve with Debit Note (₹XX,XXX)'.</w:t>
-      </w:r>
-    </w:p>
-    <w:p>
-      <w:pPr>
-        <w:pStyle w:val="Heading2"/>
-      </w:pPr>
-      <w:r>
-        <w:t>6.4 State &amp; Data Flow (Frontend Logic)</w:t>
-      </w:r>
-    </w:p>
-    <w:p>
-      <w:r>
-        <w:t>• Hierarchical Immutability: Invoice line modifications update nested trip structures through immutable state mappings, ensuring parent table and modal metrics remain synchronized.</w:t>
-        <w:br/>
-        <w:t>• Net Payable Calculation Engine: Net Payable Authorized = max(0, Gross Amount - Sum(Dispute Amounts)).</w:t>
-        <w:br/>
-        <w:t>• Conditional Badge State: When any line item contains isDisputed: true, the invoice status automatically updates from 'Pending Approval' to 'Partially Disputed'.</w:t>
-      </w:r>
-    </w:p>
-    <w:p>
-      <w:pPr>
-        <w:spacing w:after="320"/>
-      </w:pPr>
-    </w:p>
-    <w:p>
-      <w:pPr>
-        <w:pStyle w:val="Heading1"/>
-      </w:pPr>
-      <w:r>
-        <w:t>7. Complete Frontend Stack &amp; Dependencies</w:t>
-      </w:r>
-    </w:p>
-    <w:tbl>
-      <w:tblPr>
-        <w:tblW w:type="auto" w:w="0"/>
-        <w:jc w:val="center"/>
-        <w:tblLook w:firstColumn="1" w:firstRow="1" w:lastColumn="0" w:lastRow="0" w:noHBand="0" w:noVBand="1" w:val="04A0"/>
-      </w:tblPr>
-      <w:tblGrid>
-        <w:gridCol w:w="3120"/>
-        <w:gridCol w:w="3120"/>
-        <w:gridCol w:w="3120"/>
-      </w:tblGrid>
-      <w:tr>
-        <w:tc>
-          <w:tcPr>
-            <w:tcW w:type="dxa" w:w="3120"/>
-            <w:shd w:fill="0F172A"/>
-          </w:tcPr>
-          <w:p>
+            <w:pPr>
+              <w:spacing w:before="40" w:after="40"/>
+            </w:pPr>
             <w:r>
               <w:rPr>
-                <w:b/>
-                <w:color w:val="FFFFFF"/>
+                <w:color w:val="334155"/>
+                <w:sz w:val="19"/>
               </w:rPr>
-              <w:t>Layer</w:t>
-            </w:r>
-          </w:p>
-        </w:tc>
-        <w:tc>
-          <w:tcPr>
-            <w:tcW w:type="dxa" w:w="3120"/>
-            <w:shd w:fill="0F172A"/>
-          </w:tcPr>
-          <w:p>
-            <w:r>
-              <w:rPr>
-                <w:b/>
-                <w:color w:val="FFFFFF"/>
-              </w:rPr>
-              <w:t>Technology</w:t>
-            </w:r>
-          </w:p>
-        </w:tc>
-        <w:tc>
-          <w:tcPr>
-            <w:tcW w:type="dxa" w:w="3120"/>
-            <w:shd w:fill="0F172A"/>
-          </w:tcPr>
-          <w:p>
-            <w:r>
-              <w:rPr>
-                <w:b/>
-                <w:color w:val="FFFFFF"/>
-              </w:rPr>
-              <w:t>Role &amp; Application in Architecture</w:t>
+              <w:t>Standardized vector icons for logistics, navigation, telematics, and security</w:t>
             </w:r>
           </w:p>
         </w:tc>
@@ -791,34 +3785,73 @@
       <w:tr>
         <w:tc>
           <w:tcPr>
-            <w:tcW w:type="dxa" w:w="3120"/>
+            <w:tcW w:type="dxa" w:w="3264"/>
+            <w:tcMar>
+              <w:top w:w="120" w:type="dxa"/>
+              <w:bottom w:w="120" w:type="dxa"/>
+              <w:left w:w="160" w:type="dxa"/>
+              <w:right w:w="160" w:type="dxa"/>
+            </w:tcMar>
+            <w:shd w:fill="FFFFFF"/>
           </w:tcPr>
           <w:p>
+            <w:pPr>
+              <w:spacing w:before="40" w:after="40"/>
+            </w:pPr>
             <w:r>
               <w:rPr>
-                <w:b/>
+                <w:color w:val="334155"/>
+                <w:sz w:val="19"/>
               </w:rPr>
-              <w:t>Framework</w:t>
+              <w:t>**Typography**</w:t>
             </w:r>
           </w:p>
         </w:tc>
         <w:tc>
           <w:tcPr>
-            <w:tcW w:type="dxa" w:w="3120"/>
+            <w:tcW w:type="dxa" w:w="3264"/>
+            <w:tcMar>
+              <w:top w:w="120" w:type="dxa"/>
+              <w:bottom w:w="120" w:type="dxa"/>
+              <w:left w:w="160" w:type="dxa"/>
+              <w:right w:w="160" w:type="dxa"/>
+            </w:tcMar>
+            <w:shd w:fill="FFFFFF"/>
           </w:tcPr>
           <w:p>
+            <w:pPr>
+              <w:spacing w:before="40" w:after="40"/>
+            </w:pPr>
             <w:r>
-              <w:t>Next.js 14 (App Router)</w:t>
+              <w:rPr>
+                <w:color w:val="334155"/>
+                <w:sz w:val="19"/>
+              </w:rPr>
+              <w:t>Inter + Monospace</w:t>
             </w:r>
           </w:p>
         </w:tc>
         <w:tc>
           <w:tcPr>
-            <w:tcW w:type="dxa" w:w="3120"/>
+            <w:tcW w:type="dxa" w:w="3264"/>
+            <w:tcMar>
+              <w:top w:w="120" w:type="dxa"/>
+              <w:bottom w:w="120" w:type="dxa"/>
+              <w:left w:w="160" w:type="dxa"/>
+              <w:right w:w="160" w:type="dxa"/>
+            </w:tcMar>
+            <w:shd w:fill="FFFFFF"/>
           </w:tcPr>
           <w:p>
+            <w:pPr>
+              <w:spacing w:before="40" w:after="40"/>
+            </w:pPr>
             <w:r>
-              <w:t>File-based routing with 'use client' stateful modals and interactive components.</w:t>
+              <w:rPr>
+                <w:color w:val="334155"/>
+                <w:sz w:val="19"/>
+              </w:rPr>
+              <w:t>Standard sans-serif for UI scanning, tabular monospaced numbers for currencies, odometers, and tokens</w:t>
             </w:r>
           </w:p>
         </w:tc>
@@ -826,191 +3859,86 @@
       <w:tr>
         <w:tc>
           <w:tcPr>
-            <w:tcW w:type="dxa" w:w="3120"/>
+            <w:tcW w:type="dxa" w:w="3264"/>
+            <w:tcMar>
+              <w:top w:w="120" w:type="dxa"/>
+              <w:bottom w:w="120" w:type="dxa"/>
+              <w:left w:w="160" w:type="dxa"/>
+              <w:right w:w="160" w:type="dxa"/>
+            </w:tcMar>
             <w:shd w:fill="F8FAFC"/>
           </w:tcPr>
           <w:p>
+            <w:pPr>
+              <w:spacing w:before="40" w:after="40"/>
+            </w:pPr>
             <w:r>
               <w:rPr>
-                <w:b/>
+                <w:color w:val="334155"/>
+                <w:sz w:val="19"/>
               </w:rPr>
-              <w:t>Styling</w:t>
+              <w:t>**State Paradigm**</w:t>
             </w:r>
           </w:p>
         </w:tc>
         <w:tc>
           <w:tcPr>
-            <w:tcW w:type="dxa" w:w="3120"/>
+            <w:tcW w:type="dxa" w:w="3264"/>
+            <w:tcMar>
+              <w:top w:w="120" w:type="dxa"/>
+              <w:bottom w:w="120" w:type="dxa"/>
+              <w:left w:w="160" w:type="dxa"/>
+              <w:right w:w="160" w:type="dxa"/>
+            </w:tcMar>
             <w:shd w:fill="F8FAFC"/>
           </w:tcPr>
           <w:p>
+            <w:pPr>
+              <w:spacing w:before="40" w:after="40"/>
+            </w:pPr>
             <w:r>
-              <w:t>Tailwind CSS</w:t>
+              <w:rPr>
+                <w:color w:val="334155"/>
+                <w:sz w:val="19"/>
+              </w:rPr>
+              <w:t>React Hooks (`useState`, `useMemo`, `useRef`)</w:t>
             </w:r>
           </w:p>
         </w:tc>
         <w:tc>
           <w:tcPr>
-            <w:tcW w:type="dxa" w:w="3120"/>
+            <w:tcW w:type="dxa" w:w="3264"/>
+            <w:tcMar>
+              <w:top w:w="120" w:type="dxa"/>
+              <w:bottom w:w="120" w:type="dxa"/>
+              <w:left w:w="160" w:type="dxa"/>
+              <w:right w:w="160" w:type="dxa"/>
+            </w:tcMar>
             <w:shd w:fill="F8FAFC"/>
           </w:tcPr>
           <w:p>
-            <w:r>
-              <w:t>Utility-first classes, high-density layouts, custom scrollbars, and responsive breakpoints.</w:t>
-            </w:r>
-          </w:p>
-        </w:tc>
-      </w:tr>
-      <w:tr>
-        <w:tc>
-          <w:tcPr>
-            <w:tcW w:type="dxa" w:w="3120"/>
-          </w:tcPr>
-          <w:p>
+            <w:pPr>
+              <w:spacing w:before="40" w:after="40"/>
+            </w:pPr>
             <w:r>
               <w:rPr>
-                <w:b/>
+                <w:color w:val="334155"/>
+                <w:sz w:val="19"/>
               </w:rPr>
-              <w:t>UI Primitives</w:t>
-            </w:r>
-          </w:p>
-        </w:tc>
-        <w:tc>
-          <w:tcPr>
-            <w:tcW w:type="dxa" w:w="3120"/>
-          </w:tcPr>
-          <w:p>
-            <w:r>
-              <w:t>shadcn/ui (Radix UI)</w:t>
-            </w:r>
-          </w:p>
-        </w:tc>
-        <w:tc>
-          <w:tcPr>
-            <w:tcW w:type="dxa" w:w="3120"/>
-          </w:tcPr>
-          <w:p>
-            <w:r>
-              <w:t>Accessible Table, Dialog, Card, Badge, Checkbox, Tabs, Textarea, and Separator.</w:t>
-            </w:r>
-          </w:p>
-        </w:tc>
-      </w:tr>
-      <w:tr>
-        <w:tc>
-          <w:tcPr>
-            <w:tcW w:type="dxa" w:w="3120"/>
-            <w:shd w:fill="F8FAFC"/>
-          </w:tcPr>
-          <w:p>
-            <w:r>
-              <w:rPr>
-                <w:b/>
-              </w:rPr>
-              <w:t>Iconography</w:t>
-            </w:r>
-          </w:p>
-        </w:tc>
-        <w:tc>
-          <w:tcPr>
-            <w:tcW w:type="dxa" w:w="3120"/>
-            <w:shd w:fill="F8FAFC"/>
-          </w:tcPr>
-          <w:p>
-            <w:r>
-              <w:t>Lucide React</w:t>
-            </w:r>
-          </w:p>
-        </w:tc>
-        <w:tc>
-          <w:tcPr>
-            <w:tcW w:type="dxa" w:w="3120"/>
-            <w:shd w:fill="F8FAFC"/>
-          </w:tcPr>
-          <w:p>
-            <w:r>
-              <w:t>Standardized vector iconography for fleet vehicles, routes, verification stamps, and telematics.</w:t>
-            </w:r>
-          </w:p>
-        </w:tc>
-      </w:tr>
-      <w:tr>
-        <w:tc>
-          <w:tcPr>
-            <w:tcW w:type="dxa" w:w="3120"/>
-          </w:tcPr>
-          <w:p>
-            <w:r>
-              <w:rPr>
-                <w:b/>
-              </w:rPr>
-              <w:t>Typography</w:t>
-            </w:r>
-          </w:p>
-        </w:tc>
-        <w:tc>
-          <w:tcPr>
-            <w:tcW w:type="dxa" w:w="3120"/>
-          </w:tcPr>
-          <w:p>
-            <w:r>
-              <w:t>Inter &amp; Tabular Monospace</w:t>
-            </w:r>
-          </w:p>
-        </w:tc>
-        <w:tc>
-          <w:tcPr>
-            <w:tcW w:type="dxa" w:w="3120"/>
-          </w:tcPr>
-          <w:p>
-            <w:r>
-              <w:t>High legibility sans-serif paired with monospace fonts for vertical currency alignment.</w:t>
-            </w:r>
-          </w:p>
-        </w:tc>
-      </w:tr>
-      <w:tr>
-        <w:tc>
-          <w:tcPr>
-            <w:tcW w:type="dxa" w:w="3120"/>
-            <w:shd w:fill="F8FAFC"/>
-          </w:tcPr>
-          <w:p>
-            <w:r>
-              <w:rPr>
-                <w:b/>
-              </w:rPr>
-              <w:t>State Management</w:t>
-            </w:r>
-          </w:p>
-        </w:tc>
-        <w:tc>
-          <w:tcPr>
-            <w:tcW w:type="dxa" w:w="3120"/>
-            <w:shd w:fill="F8FAFC"/>
-          </w:tcPr>
-          <w:p>
-            <w:r>
-              <w:t>React Hooks (useState, useMemo, useRef)</w:t>
-            </w:r>
-          </w:p>
-        </w:tc>
-        <w:tc>
-          <w:tcPr>
-            <w:tcW w:type="dxa" w:w="3120"/>
-            <w:shd w:fill="F8FAFC"/>
-          </w:tcPr>
-          <w:p>
-            <w:r>
-              <w:t>Zero-latency client-side filtering, EOD tally reconciliation, and canvas signing.</w:t>
+              <w:t>Zero-latency client-side filtering, live GST tax calculations, canvas drawing, and password validation</w:t>
             </w:r>
           </w:p>
         </w:tc>
       </w:tr>
     </w:tbl>
+    <w:p>
+      <w:pPr>
+        <w:spacing w:after="80"/>
+      </w:pPr>
+    </w:p>
     <w:sectPr>
       <w:pgSz w:w="12240" w:h="15840"/>
-      <w:pgMar w:top="1440" w:right="1440" w:bottom="1440" w:left="1440" w:header="720" w:footer="720" w:gutter="0"/>
+      <w:pgMar w:top="1152" w:right="1224" w:bottom="1152" w:left="1224" w:header="720" w:footer="720" w:gutter="0"/>
       <w:cols w:space="720"/>
       <w:docGrid w:linePitch="360"/>
     </w:sectPr>
@@ -1384,7 +4312,7 @@
     <w:rPr>
       <w:rFonts w:ascii="Calibri" w:hAnsi="Calibri"/>
       <w:color w:val="1E293B"/>
-      <w:sz w:val="22"/>
+      <w:sz w:val="21"/>
     </w:rPr>
   </w:style>
   <w:style w:type="paragraph" w:styleId="Header">
@@ -1449,7 +4377,7 @@
       <w:rFonts w:asciiTheme="majorHAnsi" w:eastAsiaTheme="majorEastAsia" w:hAnsiTheme="majorHAnsi" w:cstheme="majorBidi"/>
       <w:b/>
       <w:bCs/>
-      <w:color w:val="0F172A"/>
+      <w:color w:val="365F91" w:themeColor="accent1" w:themeShade="BF"/>
       <w:sz w:val="28"/>
       <w:szCs w:val="28"/>
     </w:rPr>

</xml_diff>

<commit_message>
feat: migrate to Bun, implement typed API client with silent 401 refresh, and setup MSW v3 mocking suite
</commit_message>
<xml_diff>
--- a/DOCUMENTATION.docx
+++ b/DOCUMENTATION.docx
@@ -3294,6 +3294,320 @@
       </w:r>
       <w:r>
         <w:t>: Base freight rates per corridor, fuel surcharges, detention/demurrage hourly penalties, and toll reimbursement policies.</w:t>
+      </w:r>
+    </w:p>
+    <w:p>
+      <w:pPr>
+        <w:spacing w:before="120" w:after="120"/>
+      </w:pPr>
+      <w:r>
+        <w:rPr>
+          <w:color w:val="CBD5E1"/>
+          <w:sz w:val="16"/>
+        </w:rPr>
+        <w:t>_______________________________________________________________________________</w:t>
+      </w:r>
+    </w:p>
+    <w:p>
+      <w:pPr>
+        <w:pStyle w:val="Heading1"/>
+        <w:spacing w:before="280" w:after="80"/>
+      </w:pPr>
+      <w:r>
+        <w:rPr>
+          <w:rFonts w:ascii="Calibri" w:hAnsi="Calibri"/>
+          <w:b/>
+          <w:color w:val="1E3A8A"/>
+          <w:sz w:val="32"/>
+        </w:rPr>
+        <w:t>9. API Client Architecture &amp; Mock Service Worker (MSW)</w:t>
+      </w:r>
+    </w:p>
+    <w:p>
+      <w:pPr>
+        <w:pStyle w:val="Heading2"/>
+        <w:spacing w:before="200" w:after="40"/>
+      </w:pPr>
+      <w:r>
+        <w:rPr>
+          <w:rFonts w:ascii="Calibri" w:hAnsi="Calibri"/>
+          <w:b/>
+          <w:color w:val="334155"/>
+          <w:sz w:val="25"/>
+        </w:rPr>
+        <w:t>9.1 Core Objective</w:t>
+      </w:r>
+    </w:p>
+    <w:p>
+      <w:pPr>
+        <w:spacing w:before="40" w:after="80"/>
+      </w:pPr>
+      <w:r>
+        <w:t>To establish a strictly-typed, enterprise-grade data fetching layer that handles token authentication, error envelope parsing, and silent 401 token refresh out-of-the-box, backed by Mock Service Worker (MSW v3) to intercept HTTP traffic and supply realistic logistics data during development.</w:t>
+      </w:r>
+    </w:p>
+    <w:p>
+      <w:pPr>
+        <w:pStyle w:val="Heading2"/>
+        <w:spacing w:before="200" w:after="40"/>
+      </w:pPr>
+      <w:r>
+        <w:rPr>
+          <w:rFonts w:ascii="Calibri" w:hAnsi="Calibri"/>
+          <w:b/>
+          <w:color w:val="334155"/>
+          <w:sz w:val="25"/>
+        </w:rPr>
+        <w:t>9.2 API Client &amp; Error Envelope Architecture (`lib/api/client.ts`)</w:t>
+      </w:r>
+    </w:p>
+    <w:p>
+      <w:pPr>
+        <w:pStyle w:val="ListBullet"/>
+        <w:spacing w:before="20" w:after="40"/>
+      </w:pPr>
+      <w:r/>
+      <w:r>
+        <w:rPr>
+          <w:b/>
+        </w:rPr>
+        <w:t>Typed Fetch Wrapper</w:t>
+      </w:r>
+      <w:r>
+        <w:t>: `apiClient.get&lt;T&gt;()`, `apiClient.post&lt;T&gt;()`, `apiClient.put&lt;T&gt;()`, `apiClient.patch&lt;T&gt;()`, `apiClient.delete&lt;T&gt;()`.</w:t>
+      </w:r>
+    </w:p>
+    <w:p>
+      <w:pPr>
+        <w:pStyle w:val="ListBullet"/>
+        <w:spacing w:before="20" w:after="40"/>
+      </w:pPr>
+      <w:r/>
+      <w:r>
+        <w:rPr>
+          <w:b/>
+        </w:rPr>
+        <w:t>Automatic Bearer Authentication</w:t>
+      </w:r>
+      <w:r>
+        <w:t>: Automatically inspects browser cookies (`vecto_access_token`) and `localStorage` to append `Authorization: Bearer &lt;token&gt;` to outbound requests unless explicitly bypassed (`skipAuth: true`).</w:t>
+      </w:r>
+    </w:p>
+    <w:p>
+      <w:pPr>
+        <w:pStyle w:val="ListBullet"/>
+        <w:spacing w:before="20" w:after="40"/>
+      </w:pPr>
+      <w:r/>
+      <w:r>
+        <w:rPr>
+          <w:b/>
+        </w:rPr>
+        <w:t>Standardized Error Envelope</w:t>
+      </w:r>
+      <w:r>
+        <w:t>: Parses enterprise REST error payloads matching the specification:</w:t>
+      </w:r>
+    </w:p>
+    <w:p>
+      <w:pPr>
+        <w:spacing w:before="80" w:after="160"/>
+        <w:ind w:left="288"/>
+      </w:pPr>
+      <w:r>
+        <w:rPr>
+          <w:rFonts w:ascii="Consolas" w:hAnsi="Consolas"/>
+          <w:color w:val="1E293B"/>
+          <w:sz w:val="17"/>
+        </w:rPr>
+        <w:t xml:space="preserve">  {</w:t>
+        <w:br/>
+        <w:t xml:space="preserve">    "error": {</w:t>
+        <w:br/>
+        <w:t xml:space="preserve">      "code": "VALIDATION_FAILED",</w:t>
+        <w:br/>
+        <w:t xml:space="preserve">      "message": "Detailed explanation of the failure",</w:t>
+        <w:br/>
+        <w:t xml:space="preserve">      "details": { ... }</w:t>
+        <w:br/>
+        <w:t xml:space="preserve">    }</w:t>
+        <w:br/>
+        <w:t xml:space="preserve">  }</w:t>
+        <w:br/>
+      </w:r>
+    </w:p>
+    <w:p>
+      <w:pPr>
+        <w:pStyle w:val="ListBullet"/>
+        <w:spacing w:before="20" w:after="40"/>
+      </w:pPr>
+      <w:r/>
+      <w:r>
+        <w:rPr>
+          <w:b/>
+        </w:rPr>
+        <w:t>Timeout &amp; Abort Handling</w:t>
+      </w:r>
+      <w:r>
+        <w:t>: Leverages native `AbortController` with configurable timeout windows (default 15,000ms), throwing typed `ApiError(408, "REQUEST_TIMEOUT", ...)` upon deadline expiration.</w:t>
+      </w:r>
+    </w:p>
+    <w:p>
+      <w:pPr>
+        <w:pStyle w:val="Heading2"/>
+        <w:spacing w:before="200" w:after="40"/>
+      </w:pPr>
+      <w:r>
+        <w:rPr>
+          <w:rFonts w:ascii="Calibri" w:hAnsi="Calibri"/>
+          <w:b/>
+          <w:color w:val="334155"/>
+          <w:sz w:val="25"/>
+        </w:rPr>
+        <w:t>9.3 Silent Token Refresh Interceptor (`lib/api/refresh.ts`)</w:t>
+      </w:r>
+    </w:p>
+    <w:p>
+      <w:pPr>
+        <w:pStyle w:val="ListBullet"/>
+        <w:spacing w:before="20" w:after="40"/>
+      </w:pPr>
+      <w:r/>
+      <w:r>
+        <w:rPr>
+          <w:b/>
+        </w:rPr>
+        <w:t>Single-Flight Mutex Deduplication</w:t>
+      </w:r>
+      <w:r>
+        <w:t>: When multiple concurrent requests encounter HTTP 401 Unauthorized, an ongoing refresh promise queue intercepts the requests. Only a single `/api/v1/auth/refresh` network call is dispatched, preventing stampedes and refresh token invalidation.</w:t>
+      </w:r>
+    </w:p>
+    <w:p>
+      <w:pPr>
+        <w:pStyle w:val="ListBullet"/>
+        <w:spacing w:before="20" w:after="40"/>
+      </w:pPr>
+      <w:r/>
+      <w:r>
+        <w:rPr>
+          <w:b/>
+        </w:rPr>
+        <w:t>Automatic Replay</w:t>
+      </w:r>
+      <w:r>
+        <w:t>: Upon successful token acquisition, the storage layer (`document.cookie` &amp; `localStorage`) is atomically updated, and the original pending request is re-executed with the fresh Bearer token.</w:t>
+      </w:r>
+    </w:p>
+    <w:p>
+      <w:pPr>
+        <w:pStyle w:val="ListBullet"/>
+        <w:spacing w:before="20" w:after="40"/>
+      </w:pPr>
+      <w:r/>
+      <w:r>
+        <w:rPr>
+          <w:b/>
+        </w:rPr>
+        <w:t>Fallback Eviction</w:t>
+      </w:r>
+      <w:r>
+        <w:t>: If token refresh fails (e.g. refresh token expired or revoked), tokens are purged and unauthenticated visitors are gracefully forwarded to `/login?from=&lt;origin&gt;`.</w:t>
+      </w:r>
+    </w:p>
+    <w:p>
+      <w:pPr>
+        <w:pStyle w:val="Heading2"/>
+        <w:spacing w:before="200" w:after="40"/>
+      </w:pPr>
+      <w:r>
+        <w:rPr>
+          <w:rFonts w:ascii="Calibri" w:hAnsi="Calibri"/>
+          <w:b/>
+          <w:color w:val="334155"/>
+          <w:sz w:val="25"/>
+        </w:rPr>
+        <w:t>9.4 MSW Handler Suite (`mocks/handlers.ts`)</w:t>
+      </w:r>
+    </w:p>
+    <w:p>
+      <w:pPr>
+        <w:pStyle w:val="ListBullet"/>
+        <w:spacing w:before="20" w:after="40"/>
+      </w:pPr>
+      <w:r/>
+      <w:r>
+        <w:rPr>
+          <w:b/>
+        </w:rPr>
+        <w:t>`POST /api/v1/auth/login`</w:t>
+      </w:r>
+      <w:r>
+        <w:t>: Simulates enterprise corporate login, issuing JWT access and refresh tokens, user profile metadata, and hub assignments.</w:t>
+      </w:r>
+    </w:p>
+    <w:p>
+      <w:pPr>
+        <w:pStyle w:val="ListBullet"/>
+        <w:spacing w:before="20" w:after="40"/>
+      </w:pPr>
+      <w:r/>
+      <w:r>
+        <w:rPr>
+          <w:b/>
+        </w:rPr>
+        <w:t>`POST /api/v1/auth/refresh`</w:t>
+      </w:r>
+      <w:r>
+        <w:t>: Validates refresh tokens and mints refreshed access credentials.</w:t>
+      </w:r>
+    </w:p>
+    <w:p>
+      <w:pPr>
+        <w:pStyle w:val="ListBullet"/>
+        <w:spacing w:before="20" w:after="40"/>
+      </w:pPr>
+      <w:r/>
+      <w:r>
+        <w:rPr>
+          <w:b/>
+        </w:rPr>
+        <w:t>`GET /api/v1/users`</w:t>
+      </w:r>
+      <w:r>
+        <w:t>: Simulates the Master Users &amp; Roles directory with dynamic URL search query filtering (`?search=...`, `?role=...`, `?status=...`).</w:t>
+      </w:r>
+    </w:p>
+    <w:p>
+      <w:pPr>
+        <w:pStyle w:val="ListBullet"/>
+        <w:spacing w:before="20" w:after="40"/>
+      </w:pPr>
+      <w:r/>
+      <w:r>
+        <w:rPr>
+          <w:b/>
+        </w:rPr>
+        <w:t>`GET /api/v1/vehicles`</w:t>
+      </w:r>
+      <w:r>
+        <w:t>: Simulates the Fleet Registry with telematics metrics (battery health, fuel level, GPS IMEI, odometer readings).</w:t>
+      </w:r>
+    </w:p>
+    <w:p>
+      <w:pPr>
+        <w:pStyle w:val="ListBullet"/>
+        <w:spacing w:before="20" w:after="40"/>
+      </w:pPr>
+      <w:r/>
+      <w:r>
+        <w:rPr>
+          <w:b/>
+        </w:rPr>
+        <w:t>Browser Bootstrap (`components/msw-provider.tsx`)</w:t>
+      </w:r>
+      <w:r>
+        <w:t>: Integrates MSW v3 in development via Next.js App Router root layout, utilizing `worker.start({ onUnhandledFrame: 'bypass' })`.</w:t>
       </w:r>
     </w:p>
     <w:p>
@@ -3433,7 +3747,7 @@
                 <w:color w:val="334155"/>
                 <w:sz w:val="19"/>
               </w:rPr>
-              <w:t>**Framework**</w:t>
+              <w:t>**Runtime &amp; Package Manager**</w:t>
             </w:r>
           </w:p>
         </w:tc>
@@ -3457,6 +3771,80 @@
                 <w:color w:val="334155"/>
                 <w:sz w:val="19"/>
               </w:rPr>
+              <w:t>Bun (v1.4+)</w:t>
+            </w:r>
+          </w:p>
+        </w:tc>
+        <w:tc>
+          <w:tcPr>
+            <w:tcW w:type="dxa" w:w="3264"/>
+            <w:tcMar>
+              <w:top w:w="120" w:type="dxa"/>
+              <w:bottom w:w="120" w:type="dxa"/>
+              <w:left w:w="160" w:type="dxa"/>
+              <w:right w:w="160" w:type="dxa"/>
+            </w:tcMar>
+            <w:shd w:fill="F8FAFC"/>
+          </w:tcPr>
+          <w:p>
+            <w:pPr>
+              <w:spacing w:before="40" w:after="40"/>
+            </w:pPr>
+            <w:r>
+              <w:rPr>
+                <w:color w:val="334155"/>
+                <w:sz w:val="19"/>
+              </w:rPr>
+              <w:t>High-performance JS runtime, bundler, and deterministic package management (`bun.lock`)</w:t>
+            </w:r>
+          </w:p>
+        </w:tc>
+      </w:tr>
+      <w:tr>
+        <w:tc>
+          <w:tcPr>
+            <w:tcW w:type="dxa" w:w="3264"/>
+            <w:tcMar>
+              <w:top w:w="120" w:type="dxa"/>
+              <w:bottom w:w="120" w:type="dxa"/>
+              <w:left w:w="160" w:type="dxa"/>
+              <w:right w:w="160" w:type="dxa"/>
+            </w:tcMar>
+            <w:shd w:fill="FFFFFF"/>
+          </w:tcPr>
+          <w:p>
+            <w:pPr>
+              <w:spacing w:before="40" w:after="40"/>
+            </w:pPr>
+            <w:r>
+              <w:rPr>
+                <w:color w:val="334155"/>
+                <w:sz w:val="19"/>
+              </w:rPr>
+              <w:t>**Framework**</w:t>
+            </w:r>
+          </w:p>
+        </w:tc>
+        <w:tc>
+          <w:tcPr>
+            <w:tcW w:type="dxa" w:w="3264"/>
+            <w:tcMar>
+              <w:top w:w="120" w:type="dxa"/>
+              <w:bottom w:w="120" w:type="dxa"/>
+              <w:left w:w="160" w:type="dxa"/>
+              <w:right w:w="160" w:type="dxa"/>
+            </w:tcMar>
+            <w:shd w:fill="FFFFFF"/>
+          </w:tcPr>
+          <w:p>
+            <w:pPr>
+              <w:spacing w:before="40" w:after="40"/>
+            </w:pPr>
+            <w:r>
+              <w:rPr>
+                <w:color w:val="334155"/>
+                <w:sz w:val="19"/>
+              </w:rPr>
               <w:t>Next.js 14 (App Router)</w:t>
             </w:r>
           </w:p>
@@ -3470,7 +3858,7 @@
               <w:left w:w="160" w:type="dxa"/>
               <w:right w:w="160" w:type="dxa"/>
             </w:tcMar>
-            <w:shd w:fill="F8FAFC"/>
+            <w:shd w:fill="FFFFFF"/>
           </w:tcPr>
           <w:p>
             <w:pPr>
@@ -3496,7 +3884,7 @@
               <w:left w:w="160" w:type="dxa"/>
               <w:right w:w="160" w:type="dxa"/>
             </w:tcMar>
-            <w:shd w:fill="FFFFFF"/>
+            <w:shd w:fill="F8FAFC"/>
           </w:tcPr>
           <w:p>
             <w:pPr>
@@ -3520,7 +3908,7 @@
               <w:left w:w="160" w:type="dxa"/>
               <w:right w:w="160" w:type="dxa"/>
             </w:tcMar>
-            <w:shd w:fill="FFFFFF"/>
+            <w:shd w:fill="F8FAFC"/>
           </w:tcPr>
           <w:p>
             <w:pPr>
@@ -3544,7 +3932,7 @@
               <w:left w:w="160" w:type="dxa"/>
               <w:right w:w="160" w:type="dxa"/>
             </w:tcMar>
-            <w:shd w:fill="FFFFFF"/>
+            <w:shd w:fill="F8FAFC"/>
           </w:tcPr>
           <w:p>
             <w:pPr>
@@ -3570,7 +3958,155 @@
               <w:left w:w="160" w:type="dxa"/>
               <w:right w:w="160" w:type="dxa"/>
             </w:tcMar>
+            <w:shd w:fill="FFFFFF"/>
+          </w:tcPr>
+          <w:p>
+            <w:pPr>
+              <w:spacing w:before="40" w:after="40"/>
+            </w:pPr>
+            <w:r>
+              <w:rPr>
+                <w:color w:val="334155"/>
+                <w:sz w:val="19"/>
+              </w:rPr>
+              <w:t>**Data Fetching**</w:t>
+            </w:r>
+          </w:p>
+        </w:tc>
+        <w:tc>
+          <w:tcPr>
+            <w:tcW w:type="dxa" w:w="3264"/>
+            <w:tcMar>
+              <w:top w:w="120" w:type="dxa"/>
+              <w:bottom w:w="120" w:type="dxa"/>
+              <w:left w:w="160" w:type="dxa"/>
+              <w:right w:w="160" w:type="dxa"/>
+            </w:tcMar>
+            <w:shd w:fill="FFFFFF"/>
+          </w:tcPr>
+          <w:p>
+            <w:pPr>
+              <w:spacing w:before="40" w:after="40"/>
+            </w:pPr>
+            <w:r>
+              <w:rPr>
+                <w:color w:val="334155"/>
+                <w:sz w:val="19"/>
+              </w:rPr>
+              <w:t>Custom Typed API Client (`lib/api/`)</w:t>
+            </w:r>
+          </w:p>
+        </w:tc>
+        <w:tc>
+          <w:tcPr>
+            <w:tcW w:type="dxa" w:w="3264"/>
+            <w:tcMar>
+              <w:top w:w="120" w:type="dxa"/>
+              <w:bottom w:w="120" w:type="dxa"/>
+              <w:left w:w="160" w:type="dxa"/>
+              <w:right w:w="160" w:type="dxa"/>
+            </w:tcMar>
+            <w:shd w:fill="FFFFFF"/>
+          </w:tcPr>
+          <w:p>
+            <w:pPr>
+              <w:spacing w:before="40" w:after="40"/>
+            </w:pPr>
+            <w:r>
+              <w:rPr>
+                <w:color w:val="334155"/>
+                <w:sz w:val="19"/>
+              </w:rPr>
+              <w:t>Standardized error envelope parsing, automatic Bearer injection, and single-flight 401 token refresh</w:t>
+            </w:r>
+          </w:p>
+        </w:tc>
+      </w:tr>
+      <w:tr>
+        <w:tc>
+          <w:tcPr>
+            <w:tcW w:type="dxa" w:w="3264"/>
+            <w:tcMar>
+              <w:top w:w="120" w:type="dxa"/>
+              <w:bottom w:w="120" w:type="dxa"/>
+              <w:left w:w="160" w:type="dxa"/>
+              <w:right w:w="160" w:type="dxa"/>
+            </w:tcMar>
             <w:shd w:fill="F8FAFC"/>
+          </w:tcPr>
+          <w:p>
+            <w:pPr>
+              <w:spacing w:before="40" w:after="40"/>
+            </w:pPr>
+            <w:r>
+              <w:rPr>
+                <w:color w:val="334155"/>
+                <w:sz w:val="19"/>
+              </w:rPr>
+              <w:t>**Network Mocking**</w:t>
+            </w:r>
+          </w:p>
+        </w:tc>
+        <w:tc>
+          <w:tcPr>
+            <w:tcW w:type="dxa" w:w="3264"/>
+            <w:tcMar>
+              <w:top w:w="120" w:type="dxa"/>
+              <w:bottom w:w="120" w:type="dxa"/>
+              <w:left w:w="160" w:type="dxa"/>
+              <w:right w:w="160" w:type="dxa"/>
+            </w:tcMar>
+            <w:shd w:fill="F8FAFC"/>
+          </w:tcPr>
+          <w:p>
+            <w:pPr>
+              <w:spacing w:before="40" w:after="40"/>
+            </w:pPr>
+            <w:r>
+              <w:rPr>
+                <w:color w:val="334155"/>
+                <w:sz w:val="19"/>
+              </w:rPr>
+              <w:t>Mock Service Worker (MSW v3)</w:t>
+            </w:r>
+          </w:p>
+        </w:tc>
+        <w:tc>
+          <w:tcPr>
+            <w:tcW w:type="dxa" w:w="3264"/>
+            <w:tcMar>
+              <w:top w:w="120" w:type="dxa"/>
+              <w:bottom w:w="120" w:type="dxa"/>
+              <w:left w:w="160" w:type="dxa"/>
+              <w:right w:w="160" w:type="dxa"/>
+            </w:tcMar>
+            <w:shd w:fill="F8FAFC"/>
+          </w:tcPr>
+          <w:p>
+            <w:pPr>
+              <w:spacing w:before="40" w:after="40"/>
+            </w:pPr>
+            <w:r>
+              <w:rPr>
+                <w:color w:val="334155"/>
+                <w:sz w:val="19"/>
+              </w:rPr>
+              <w:t>Client-side service worker interceptor for Auth, Master Users, and Fleet Telematics</w:t>
+            </w:r>
+          </w:p>
+        </w:tc>
+      </w:tr>
+      <w:tr>
+        <w:tc>
+          <w:tcPr>
+            <w:tcW w:type="dxa" w:w="3264"/>
+            <w:tcMar>
+              <w:top w:w="120" w:type="dxa"/>
+              <w:bottom w:w="120" w:type="dxa"/>
+              <w:left w:w="160" w:type="dxa"/>
+              <w:right w:w="160" w:type="dxa"/>
+            </w:tcMar>
+            <w:shd w:fill="FFFFFF"/>
           </w:tcPr>
           <w:p>
             <w:pPr>
@@ -3594,7 +4130,7 @@
               <w:left w:w="160" w:type="dxa"/>
               <w:right w:w="160" w:type="dxa"/>
             </w:tcMar>
-            <w:shd w:fill="F8FAFC"/>
+            <w:shd w:fill="FFFFFF"/>
           </w:tcPr>
           <w:p>
             <w:pPr>
@@ -3618,7 +4154,7 @@
               <w:left w:w="160" w:type="dxa"/>
               <w:right w:w="160" w:type="dxa"/>
             </w:tcMar>
-            <w:shd w:fill="F8FAFC"/>
+            <w:shd w:fill="FFFFFF"/>
           </w:tcPr>
           <w:p>
             <w:pPr>
@@ -3644,7 +4180,7 @@
               <w:left w:w="160" w:type="dxa"/>
               <w:right w:w="160" w:type="dxa"/>
             </w:tcMar>
-            <w:shd w:fill="FFFFFF"/>
+            <w:shd w:fill="F8FAFC"/>
           </w:tcPr>
           <w:p>
             <w:pPr>
@@ -3668,7 +4204,7 @@
               <w:left w:w="160" w:type="dxa"/>
               <w:right w:w="160" w:type="dxa"/>
             </w:tcMar>
-            <w:shd w:fill="FFFFFF"/>
+            <w:shd w:fill="F8FAFC"/>
           </w:tcPr>
           <w:p>
             <w:pPr>
@@ -3692,7 +4228,7 @@
               <w:left w:w="160" w:type="dxa"/>
               <w:right w:w="160" w:type="dxa"/>
             </w:tcMar>
-            <w:shd w:fill="FFFFFF"/>
+            <w:shd w:fill="F8FAFC"/>
           </w:tcPr>
           <w:p>
             <w:pPr>
@@ -3718,7 +4254,7 @@
               <w:left w:w="160" w:type="dxa"/>
               <w:right w:w="160" w:type="dxa"/>
             </w:tcMar>
-            <w:shd w:fill="F8FAFC"/>
+            <w:shd w:fill="FFFFFF"/>
           </w:tcPr>
           <w:p>
             <w:pPr>
@@ -3742,7 +4278,7 @@
               <w:left w:w="160" w:type="dxa"/>
               <w:right w:w="160" w:type="dxa"/>
             </w:tcMar>
-            <w:shd w:fill="F8FAFC"/>
+            <w:shd w:fill="FFFFFF"/>
           </w:tcPr>
           <w:p>
             <w:pPr>
@@ -3766,7 +4302,7 @@
               <w:left w:w="160" w:type="dxa"/>
               <w:right w:w="160" w:type="dxa"/>
             </w:tcMar>
-            <w:shd w:fill="F8FAFC"/>
+            <w:shd w:fill="FFFFFF"/>
           </w:tcPr>
           <w:p>
             <w:pPr>
@@ -3792,7 +4328,7 @@
               <w:left w:w="160" w:type="dxa"/>
               <w:right w:w="160" w:type="dxa"/>
             </w:tcMar>
-            <w:shd w:fill="FFFFFF"/>
+            <w:shd w:fill="F8FAFC"/>
           </w:tcPr>
           <w:p>
             <w:pPr>
@@ -3816,7 +4352,7 @@
               <w:left w:w="160" w:type="dxa"/>
               <w:right w:w="160" w:type="dxa"/>
             </w:tcMar>
-            <w:shd w:fill="FFFFFF"/>
+            <w:shd w:fill="F8FAFC"/>
           </w:tcPr>
           <w:p>
             <w:pPr>
@@ -3840,7 +4376,7 @@
               <w:left w:w="160" w:type="dxa"/>
               <w:right w:w="160" w:type="dxa"/>
             </w:tcMar>
-            <w:shd w:fill="FFFFFF"/>
+            <w:shd w:fill="F8FAFC"/>
           </w:tcPr>
           <w:p>
             <w:pPr>
@@ -3866,7 +4402,7 @@
               <w:left w:w="160" w:type="dxa"/>
               <w:right w:w="160" w:type="dxa"/>
             </w:tcMar>
-            <w:shd w:fill="F8FAFC"/>
+            <w:shd w:fill="FFFFFF"/>
           </w:tcPr>
           <w:p>
             <w:pPr>
@@ -3890,7 +4426,7 @@
               <w:left w:w="160" w:type="dxa"/>
               <w:right w:w="160" w:type="dxa"/>
             </w:tcMar>
-            <w:shd w:fill="F8FAFC"/>
+            <w:shd w:fill="FFFFFF"/>
           </w:tcPr>
           <w:p>
             <w:pPr>
@@ -3914,7 +4450,7 @@
               <w:left w:w="160" w:type="dxa"/>
               <w:right w:w="160" w:type="dxa"/>
             </w:tcMar>
-            <w:shd w:fill="F8FAFC"/>
+            <w:shd w:fill="FFFFFF"/>
           </w:tcPr>
           <w:p>
             <w:pPr>

</xml_diff>